<commit_message>
fixes to children review block
</commit_message>
<xml_diff>
--- a/docassemble/MODivorceForms/data/templates/parenting_plan_attachment_addendum.docx
+++ b/docassemble/MODivorceForms/data/templates/parenting_plan_attachment_addendum.docx
@@ -893,23 +893,7 @@
           <w:sz w:val="24"/>
           <w:szCs w:val="24"/>
         </w:rPr>
-        <w:t xml:space="preserve">{%p for field in </w:t>
-      </w:r>
-      <w:r>
-        <w:rPr>
-          <w:rFonts w:ascii="Helvetica" w:hAnsi="Helvetica"/>
-          <w:sz w:val="24"/>
-          <w:szCs w:val="24"/>
-        </w:rPr>
-        <w:t>parenting_plan</w:t>
-      </w:r>
-      <w:r>
-        <w:rPr>
-          <w:rFonts w:ascii="Helvetica" w:hAnsi="Helvetica"/>
-          <w:sz w:val="24"/>
-          <w:szCs w:val="24"/>
-        </w:rPr>
-        <w:t>_attachment[i].overflow() %}</w:t>
+        <w:t>{%p for field in parenting_plan_attachment[i].overflow() %}</w:t>
       </w:r>
     </w:p>
     <w:p>
@@ -951,7 +935,7 @@
         <w:gridCol w:w="4152"/>
         <w:gridCol w:w="2190"/>
         <w:gridCol w:w="1510"/>
-        <w:gridCol w:w="1508"/>
+        <w:gridCol w:w="1507"/>
       </w:tblGrid>
       <w:tr>
         <w:trPr/>
@@ -1056,7 +1040,7 @@
         </w:tc>
         <w:tc>
           <w:tcPr>
-            <w:tcW w:w="1508" w:type="dxa"/>
+            <w:tcW w:w="1507" w:type="dxa"/>
             <w:tcBorders/>
           </w:tcPr>
           <w:p>
@@ -1180,7 +1164,7 @@
         </w:tc>
         <w:tc>
           <w:tcPr>
-            <w:tcW w:w="1508" w:type="dxa"/>
+            <w:tcW w:w="1507" w:type="dxa"/>
             <w:tcBorders/>
           </w:tcPr>
           <w:p>
@@ -1296,67 +1280,35 @@
                 <w:sz w:val="24"/>
                 <w:szCs w:val="24"/>
               </w:rPr>
-              <w:t>{{ row.</w:t>
-            </w:r>
-            <w:r>
-              <w:rPr>
-                <w:rFonts w:ascii="Helvetica" w:hAnsi="Helvetica"/>
-                <w:sz w:val="24"/>
-                <w:szCs w:val="24"/>
-              </w:rPr>
-              <w:t>tax_dependency_even</w:t>
-            </w:r>
-            <w:r>
-              <w:rPr>
-                <w:rFonts w:ascii="Helvetica" w:hAnsi="Helvetica"/>
-                <w:sz w:val="24"/>
-                <w:szCs w:val="24"/>
-              </w:rPr>
-              <w:t xml:space="preserve"> }}</w:t>
-            </w:r>
-          </w:p>
-        </w:tc>
-        <w:tc>
-          <w:tcPr>
-            <w:tcW w:w="1508" w:type="dxa"/>
-            <w:tcBorders/>
-          </w:tcPr>
-          <w:p>
-            <w:pPr>
-              <w:pStyle w:val="Normal"/>
-              <w:widowControl w:val="false"/>
-              <w:suppressAutoHyphens w:val="true"/>
-              <w:spacing w:lineRule="auto" w:line="240" w:before="0" w:after="0"/>
-              <w:jc w:val="left"/>
-              <w:rPr>
-                <w:rFonts w:ascii="Helvetica" w:hAnsi="Helvetica"/>
-                <w:sz w:val="24"/>
-                <w:szCs w:val="24"/>
-              </w:rPr>
-            </w:pPr>
-            <w:r>
-              <w:rPr>
-                <w:rFonts w:ascii="Helvetica" w:hAnsi="Helvetica"/>
-                <w:sz w:val="24"/>
-                <w:szCs w:val="24"/>
-              </w:rPr>
-              <w:t>{{ row.</w:t>
-            </w:r>
-            <w:r>
-              <w:rPr>
-                <w:rFonts w:ascii="Helvetica" w:hAnsi="Helvetica"/>
-                <w:sz w:val="24"/>
-                <w:szCs w:val="24"/>
-              </w:rPr>
-              <w:t>tax_dependency_odd</w:t>
-            </w:r>
-            <w:r>
-              <w:rPr>
-                <w:rFonts w:ascii="Helvetica" w:hAnsi="Helvetica"/>
-                <w:sz w:val="24"/>
-                <w:szCs w:val="24"/>
-              </w:rPr>
-              <w:t xml:space="preserve"> }}</w:t>
+              <w:t>{{ row.tax_dependency_even }}</w:t>
+            </w:r>
+          </w:p>
+        </w:tc>
+        <w:tc>
+          <w:tcPr>
+            <w:tcW w:w="1507" w:type="dxa"/>
+            <w:tcBorders/>
+          </w:tcPr>
+          <w:p>
+            <w:pPr>
+              <w:pStyle w:val="Normal"/>
+              <w:widowControl w:val="false"/>
+              <w:suppressAutoHyphens w:val="true"/>
+              <w:spacing w:lineRule="auto" w:line="240" w:before="0" w:after="0"/>
+              <w:jc w:val="left"/>
+              <w:rPr>
+                <w:rFonts w:ascii="Helvetica" w:hAnsi="Helvetica"/>
+                <w:sz w:val="24"/>
+                <w:szCs w:val="24"/>
+              </w:rPr>
+            </w:pPr>
+            <w:r>
+              <w:rPr>
+                <w:rFonts w:ascii="Helvetica" w:hAnsi="Helvetica"/>
+                <w:sz w:val="24"/>
+                <w:szCs w:val="24"/>
+              </w:rPr>
+              <w:t>{{ row.tax_dependency_odd }}</w:t>
             </w:r>
           </w:p>
         </w:tc>
@@ -1453,7 +1405,7 @@
         </w:tc>
         <w:tc>
           <w:tcPr>
-            <w:tcW w:w="1508" w:type="dxa"/>
+            <w:tcW w:w="1507" w:type="dxa"/>
             <w:tcBorders/>
           </w:tcPr>
           <w:p>
@@ -1495,39 +1447,7 @@
           <w:sz w:val="24"/>
           <w:szCs w:val="24"/>
         </w:rPr>
-        <w:t xml:space="preserve">{%p </w:t>
-      </w:r>
-      <w:r>
-        <w:rPr>
-          <w:rFonts w:ascii="Helvetica" w:hAnsi="Helvetica"/>
-          <w:sz w:val="24"/>
-          <w:szCs w:val="24"/>
-        </w:rPr>
-        <w:t>el</w:t>
-      </w:r>
-      <w:r>
-        <w:rPr>
-          <w:rFonts w:ascii="Helvetica" w:hAnsi="Helvetica"/>
-          <w:sz w:val="24"/>
-          <w:szCs w:val="24"/>
-        </w:rPr>
-        <w:t>if field.field_name in [“</w:t>
-      </w:r>
-      <w:r>
-        <w:rPr>
-          <w:rFonts w:ascii="Helvetica" w:hAnsi="Helvetica"/>
-          <w:sz w:val="24"/>
-          <w:szCs w:val="24"/>
-        </w:rPr>
-        <w:t>other_holidays</w:t>
-      </w:r>
-      <w:r>
-        <w:rPr>
-          <w:rFonts w:ascii="Helvetica" w:hAnsi="Helvetica"/>
-          <w:sz w:val="24"/>
-          <w:szCs w:val="24"/>
-        </w:rPr>
-        <w:t>”] %}</w:t>
+        <w:t>{%p elif field.field_name in [“other_holidays”] %}</w:t>
       </w:r>
     </w:p>
     <w:p>
@@ -1568,17 +1488,17 @@
         <w:tblLook w:val="04a0" w:noHBand="0" w:noVBand="1" w:firstColumn="1" w:lastRow="0" w:lastColumn="0" w:firstRow="1"/>
       </w:tblPr>
       <w:tblGrid>
-        <w:gridCol w:w="2610"/>
-        <w:gridCol w:w="2430"/>
-        <w:gridCol w:w="2160"/>
+        <w:gridCol w:w="2609"/>
+        <w:gridCol w:w="2431"/>
+        <w:gridCol w:w="2159"/>
         <w:gridCol w:w="1170"/>
-        <w:gridCol w:w="990"/>
+        <w:gridCol w:w="991"/>
       </w:tblGrid>
       <w:tr>
         <w:trPr/>
         <w:tc>
           <w:tcPr>
-            <w:tcW w:w="2610" w:type="dxa"/>
+            <w:tcW w:w="2609" w:type="dxa"/>
             <w:tcBorders/>
           </w:tcPr>
           <w:p>
@@ -1609,7 +1529,7 @@
         </w:tc>
         <w:tc>
           <w:tcPr>
-            <w:tcW w:w="2430" w:type="dxa"/>
+            <w:tcW w:w="2431" w:type="dxa"/>
             <w:tcBorders>
               <w:right w:val="nil"/>
             </w:tcBorders>
@@ -1642,7 +1562,7 @@
         </w:tc>
         <w:tc>
           <w:tcPr>
-            <w:tcW w:w="2160" w:type="dxa"/>
+            <w:tcW w:w="2159" w:type="dxa"/>
             <w:tcBorders>
               <w:right w:val="nil"/>
             </w:tcBorders>
@@ -1712,7 +1632,7 @@
         </w:tc>
         <w:tc>
           <w:tcPr>
-            <w:tcW w:w="990" w:type="dxa"/>
+            <w:tcW w:w="991" w:type="dxa"/>
             <w:tcBorders/>
           </w:tcPr>
           <w:p>
@@ -1748,7 +1668,7 @@
         <w:trPr/>
         <w:tc>
           <w:tcPr>
-            <w:tcW w:w="2610" w:type="dxa"/>
+            <w:tcW w:w="2609" w:type="dxa"/>
             <w:tcBorders/>
           </w:tcPr>
           <w:p>
@@ -1778,7 +1698,7 @@
         </w:tc>
         <w:tc>
           <w:tcPr>
-            <w:tcW w:w="2430" w:type="dxa"/>
+            <w:tcW w:w="2431" w:type="dxa"/>
             <w:tcBorders>
               <w:right w:val="nil"/>
             </w:tcBorders>
@@ -1807,7 +1727,7 @@
         </w:tc>
         <w:tc>
           <w:tcPr>
-            <w:tcW w:w="2160" w:type="dxa"/>
+            <w:tcW w:w="2159" w:type="dxa"/>
             <w:tcBorders>
               <w:right w:val="nil"/>
             </w:tcBorders>
@@ -1865,7 +1785,7 @@
         </w:tc>
         <w:tc>
           <w:tcPr>
-            <w:tcW w:w="990" w:type="dxa"/>
+            <w:tcW w:w="991" w:type="dxa"/>
             <w:tcBorders/>
           </w:tcPr>
           <w:p>
@@ -1895,57 +1815,37 @@
         <w:trPr/>
         <w:tc>
           <w:tcPr>
-            <w:tcW w:w="2610" w:type="dxa"/>
-            <w:tcBorders/>
-          </w:tcPr>
-          <w:p>
-            <w:pPr>
-              <w:pStyle w:val="Normal"/>
-              <w:widowControl w:val="false"/>
-              <w:suppressAutoHyphens w:val="true"/>
-              <w:spacing w:lineRule="auto" w:line="240" w:before="0" w:after="0"/>
-              <w:jc w:val="left"/>
-              <w:rPr>
-                <w:rFonts w:ascii="Helvetica" w:hAnsi="Helvetica"/>
-                <w:sz w:val="24"/>
-                <w:szCs w:val="24"/>
-              </w:rPr>
-            </w:pPr>
-            <w:r>
-              <w:rPr>
-                <w:rFonts w:eastAsia="Calibri" w:cs="Arial" w:ascii="Helvetica" w:hAnsi="Helvetica"/>
-                <w:kern w:val="0"/>
-                <w:sz w:val="24"/>
-                <w:szCs w:val="24"/>
-                <w:lang w:val="en-US" w:eastAsia="en-US" w:bidi="ar-SA"/>
-              </w:rPr>
-              <w:t>{{ row.</w:t>
-            </w:r>
-            <w:r>
-              <w:rPr>
-                <w:rFonts w:eastAsia="Calibri" w:cs="Arial" w:ascii="Helvetica" w:hAnsi="Helvetica"/>
-                <w:kern w:val="0"/>
-                <w:sz w:val="24"/>
-                <w:szCs w:val="24"/>
-                <w:lang w:val="en-US" w:eastAsia="en-US" w:bidi="ar-SA"/>
-              </w:rPr>
-              <w:t>description</w:t>
-            </w:r>
-            <w:r>
-              <w:rPr>
-                <w:rFonts w:eastAsia="Calibri" w:cs="Arial" w:ascii="Helvetica" w:hAnsi="Helvetica"/>
-                <w:kern w:val="0"/>
-                <w:sz w:val="24"/>
-                <w:szCs w:val="24"/>
-                <w:lang w:val="en-US" w:eastAsia="en-US" w:bidi="ar-SA"/>
-              </w:rPr>
-              <w:t xml:space="preserve"> }}</w:t>
-            </w:r>
-          </w:p>
-        </w:tc>
-        <w:tc>
-          <w:tcPr>
-            <w:tcW w:w="2430" w:type="dxa"/>
+            <w:tcW w:w="2609" w:type="dxa"/>
+            <w:tcBorders/>
+          </w:tcPr>
+          <w:p>
+            <w:pPr>
+              <w:pStyle w:val="Normal"/>
+              <w:widowControl w:val="false"/>
+              <w:suppressAutoHyphens w:val="true"/>
+              <w:spacing w:lineRule="auto" w:line="240" w:before="0" w:after="0"/>
+              <w:jc w:val="left"/>
+              <w:rPr>
+                <w:rFonts w:ascii="Helvetica" w:hAnsi="Helvetica"/>
+                <w:sz w:val="24"/>
+                <w:szCs w:val="24"/>
+              </w:rPr>
+            </w:pPr>
+            <w:r>
+              <w:rPr>
+                <w:rFonts w:eastAsia="Calibri" w:cs="Arial" w:ascii="Helvetica" w:hAnsi="Helvetica"/>
+                <w:kern w:val="0"/>
+                <w:sz w:val="24"/>
+                <w:szCs w:val="24"/>
+                <w:lang w:val="en-US" w:eastAsia="en-US" w:bidi="ar-SA"/>
+              </w:rPr>
+              <w:t>{{ row.description }}</w:t>
+            </w:r>
+          </w:p>
+        </w:tc>
+        <w:tc>
+          <w:tcPr>
+            <w:tcW w:w="2431" w:type="dxa"/>
             <w:tcBorders>
               <w:right w:val="nil"/>
             </w:tcBorders>
@@ -1971,33 +1871,13 @@
                 <w:szCs w:val="24"/>
                 <w:lang w:val="en-US" w:eastAsia="en-US" w:bidi="ar-SA"/>
               </w:rPr>
-              <w:t>{{ role_dictionary_full_name[</w:t>
-            </w:r>
-            <w:r>
-              <w:rPr>
-                <w:rFonts w:eastAsia="Calibri" w:cs="Arial" w:ascii="Helvetica" w:hAnsi="Helvetica"/>
-                <w:kern w:val="0"/>
-                <w:sz w:val="24"/>
-                <w:szCs w:val="24"/>
-                <w:lang w:val="en-US" w:eastAsia="en-US" w:bidi="ar-SA"/>
-              </w:rPr>
-              <w:t>row</w:t>
-            </w:r>
-            <w:r>
-              <w:rPr>
-                <w:rFonts w:eastAsia="Calibri" w:cs="Arial" w:ascii="Helvetica" w:hAnsi="Helvetica"/>
-                <w:kern w:val="0"/>
-                <w:sz w:val="24"/>
-                <w:szCs w:val="24"/>
-                <w:lang w:val="en-US" w:eastAsia="en-US" w:bidi="ar-SA"/>
-              </w:rPr>
-              <w:t>.even_years] }}</w:t>
-            </w:r>
-          </w:p>
-        </w:tc>
-        <w:tc>
-          <w:tcPr>
-            <w:tcW w:w="2160" w:type="dxa"/>
+              <w:t>{{ role_dictionary_full_name[row.even_years] }}</w:t>
+            </w:r>
+          </w:p>
+        </w:tc>
+        <w:tc>
+          <w:tcPr>
+            <w:tcW w:w="2159" w:type="dxa"/>
             <w:tcBorders>
               <w:right w:val="nil"/>
             </w:tcBorders>
@@ -2031,47 +1911,7 @@
                 <w:szCs w:val="24"/>
                 <w:lang w:val="en-US" w:eastAsia="en-US" w:bidi="ar-SA"/>
               </w:rPr>
-              <w:t>{ role_dictionary_full_name[</w:t>
-            </w:r>
-            <w:r>
-              <w:rPr>
-                <w:rFonts w:eastAsia="Calibri" w:cs="Arial" w:ascii="Helvetica" w:hAnsi="Helvetica"/>
-                <w:kern w:val="0"/>
-                <w:sz w:val="24"/>
-                <w:szCs w:val="24"/>
-                <w:lang w:val="en-US" w:eastAsia="en-US" w:bidi="ar-SA"/>
-              </w:rPr>
-              <w:t>row</w:t>
-            </w:r>
-            <w:r>
-              <w:rPr>
-                <w:rFonts w:eastAsia="Calibri" w:cs="Arial" w:ascii="Helvetica" w:hAnsi="Helvetica"/>
-                <w:kern w:val="0"/>
-                <w:sz w:val="24"/>
-                <w:szCs w:val="24"/>
-                <w:lang w:val="en-US" w:eastAsia="en-US" w:bidi="ar-SA"/>
-              </w:rPr>
-              <w:t>.</w:t>
-            </w:r>
-            <w:r>
-              <w:rPr>
-                <w:rFonts w:eastAsia="Calibri" w:cs="Arial" w:ascii="Helvetica" w:hAnsi="Helvetica"/>
-                <w:kern w:val="0"/>
-                <w:sz w:val="24"/>
-                <w:szCs w:val="24"/>
-                <w:lang w:val="en-US" w:eastAsia="en-US" w:bidi="ar-SA"/>
-              </w:rPr>
-              <w:t>odd</w:t>
-            </w:r>
-            <w:r>
-              <w:rPr>
-                <w:rFonts w:eastAsia="Calibri" w:cs="Arial" w:ascii="Helvetica" w:hAnsi="Helvetica"/>
-                <w:kern w:val="0"/>
-                <w:sz w:val="24"/>
-                <w:szCs w:val="24"/>
-                <w:lang w:val="en-US" w:eastAsia="en-US" w:bidi="ar-SA"/>
-              </w:rPr>
-              <w:t>_years] }}</w:t>
+              <w:t>{ role_dictionary_full_name[row.odd_years] }}</w:t>
             </w:r>
           </w:p>
         </w:tc>
@@ -2107,7 +1947,7 @@
         </w:tc>
         <w:tc>
           <w:tcPr>
-            <w:tcW w:w="990" w:type="dxa"/>
+            <w:tcW w:w="991" w:type="dxa"/>
             <w:tcBorders/>
           </w:tcPr>
           <w:p>
@@ -2138,7 +1978,7 @@
         <w:trPr/>
         <w:tc>
           <w:tcPr>
-            <w:tcW w:w="2610" w:type="dxa"/>
+            <w:tcW w:w="2609" w:type="dxa"/>
             <w:tcBorders/>
           </w:tcPr>
           <w:p>
@@ -2168,7 +2008,7 @@
         </w:tc>
         <w:tc>
           <w:tcPr>
-            <w:tcW w:w="2430" w:type="dxa"/>
+            <w:tcW w:w="2431" w:type="dxa"/>
             <w:tcBorders>
               <w:right w:val="nil"/>
             </w:tcBorders>
@@ -2197,7 +2037,7 @@
         </w:tc>
         <w:tc>
           <w:tcPr>
-            <w:tcW w:w="2160" w:type="dxa"/>
+            <w:tcW w:w="2159" w:type="dxa"/>
             <w:tcBorders>
               <w:right w:val="nil"/>
             </w:tcBorders>
@@ -2255,7 +2095,7 @@
         </w:tc>
         <w:tc>
           <w:tcPr>
-            <w:tcW w:w="990" w:type="dxa"/>
+            <w:tcW w:w="991" w:type="dxa"/>
             <w:tcBorders/>
           </w:tcPr>
           <w:p>
@@ -2314,39 +2154,7 @@
           <w:sz w:val="24"/>
           <w:szCs w:val="24"/>
         </w:rPr>
-        <w:t>{%p elif field.field_name in ["support_payer.extraordinary_</w:t>
-      </w:r>
-      <w:r>
-        <w:rPr>
-          <w:rFonts w:ascii="Helvetica" w:hAnsi="Helvetica"/>
-          <w:sz w:val="24"/>
-          <w:szCs w:val="24"/>
-        </w:rPr>
-        <w:t>medical</w:t>
-      </w:r>
-      <w:r>
-        <w:rPr>
-          <w:rFonts w:ascii="Helvetica" w:hAnsi="Helvetica"/>
-          <w:sz w:val="24"/>
-          <w:szCs w:val="24"/>
-        </w:rPr>
-        <w:t>_costs"</w:t>
-      </w:r>
-      <w:r>
-        <w:rPr>
-          <w:rFonts w:ascii="Helvetica" w:hAnsi="Helvetica"/>
-          <w:sz w:val="24"/>
-          <w:szCs w:val="24"/>
-        </w:rPr>
-        <w:t>]</w:t>
-      </w:r>
-      <w:r>
-        <w:rPr>
-          <w:rFonts w:ascii="Helvetica" w:hAnsi="Helvetica"/>
-          <w:sz w:val="24"/>
-          <w:szCs w:val="24"/>
-        </w:rPr>
-        <w:t xml:space="preserve"> %}</w:t>
+        <w:t>{%p elif field.field_name in ["support_payer.extraordinary_medical_costs"] %}</w:t>
       </w:r>
     </w:p>
     <w:p>
@@ -2368,39 +2176,7 @@
           <w:sz w:val="24"/>
           <w:szCs w:val="24"/>
         </w:rPr>
-        <w:t>8</w:t>
-      </w:r>
-      <w:r>
-        <w:rPr>
-          <w:rFonts w:cs="Arial" w:ascii="Helvetica" w:hAnsi="Helvetica"/>
-          <w:sz w:val="24"/>
-          <w:szCs w:val="24"/>
-        </w:rPr>
-        <w:t xml:space="preserve">. </w:t>
-      </w:r>
-      <w:r>
-        <w:rPr>
-          <w:rFonts w:cs="Arial" w:ascii="Helvetica" w:hAnsi="Helvetica"/>
-          <w:sz w:val="24"/>
-          <w:szCs w:val="24"/>
-        </w:rPr>
-        <w:t xml:space="preserve">Extraordinary </w:t>
-      </w:r>
-      <w:r>
-        <w:rPr>
-          <w:rFonts w:cs="Arial" w:ascii="Helvetica" w:hAnsi="Helvetica"/>
-          <w:sz w:val="24"/>
-          <w:szCs w:val="24"/>
-        </w:rPr>
-        <w:t xml:space="preserve">Medical </w:t>
-      </w:r>
-      <w:r>
-        <w:rPr>
-          <w:rFonts w:cs="Arial" w:ascii="Helvetica" w:hAnsi="Helvetica"/>
-          <w:sz w:val="24"/>
-          <w:szCs w:val="24"/>
-        </w:rPr>
-        <w:t xml:space="preserve">Costs for {{ support_payer.name_full() }} </w:t>
+        <w:t xml:space="preserve">8. Extraordinary Medical Costs for {{ support_payer.name_full() }} </w:t>
       </w:r>
     </w:p>
     <w:tbl>
@@ -2419,14 +2195,14 @@
         <w:tblLook w:val="04a0" w:noHBand="0" w:noVBand="1" w:firstColumn="1" w:lastRow="0" w:lastColumn="0" w:firstRow="1"/>
       </w:tblPr>
       <w:tblGrid>
-        <w:gridCol w:w="6300"/>
-        <w:gridCol w:w="1304"/>
+        <w:gridCol w:w="7754"/>
+        <w:gridCol w:w="1605"/>
       </w:tblGrid>
       <w:tr>
         <w:trPr/>
         <w:tc>
           <w:tcPr>
-            <w:tcW w:w="6300" w:type="dxa"/>
+            <w:tcW w:w="7754" w:type="dxa"/>
             <w:tcBorders/>
           </w:tcPr>
           <w:p>
@@ -2457,7 +2233,7 @@
         </w:tc>
         <w:tc>
           <w:tcPr>
-            <w:tcW w:w="1304" w:type="dxa"/>
+            <w:tcW w:w="1605" w:type="dxa"/>
             <w:tcBorders/>
           </w:tcPr>
           <w:p>
@@ -2491,7 +2267,7 @@
         <w:trPr/>
         <w:tc>
           <w:tcPr>
-            <w:tcW w:w="6300" w:type="dxa"/>
+            <w:tcW w:w="7754" w:type="dxa"/>
             <w:tcBorders/>
           </w:tcPr>
           <w:p>
@@ -2521,7 +2297,7 @@
         </w:tc>
         <w:tc>
           <w:tcPr>
-            <w:tcW w:w="1304" w:type="dxa"/>
+            <w:tcW w:w="1605" w:type="dxa"/>
             <w:tcBorders/>
           </w:tcPr>
           <w:p>
@@ -2551,141 +2327,81 @@
         <w:trPr/>
         <w:tc>
           <w:tcPr>
-            <w:tcW w:w="6300" w:type="dxa"/>
-            <w:tcBorders/>
-          </w:tcPr>
-          <w:p>
-            <w:pPr>
-              <w:pStyle w:val="Normal"/>
-              <w:widowControl w:val="false"/>
-              <w:suppressAutoHyphens w:val="true"/>
-              <w:spacing w:lineRule="auto" w:line="240" w:before="0" w:after="0"/>
-              <w:jc w:val="left"/>
-              <w:rPr>
-                <w:rFonts w:ascii="Helvetica" w:hAnsi="Helvetica"/>
-                <w:sz w:val="24"/>
-                <w:szCs w:val="24"/>
-              </w:rPr>
-            </w:pPr>
-            <w:r>
-              <w:rPr>
-                <w:rFonts w:eastAsia="Calibri" w:cs="Arial" w:ascii="Helvetica" w:hAnsi="Helvetica"/>
-                <w:kern w:val="0"/>
-                <w:sz w:val="24"/>
-                <w:szCs w:val="24"/>
-                <w:lang w:val="en-US" w:eastAsia="en-US" w:bidi="ar-SA"/>
-              </w:rPr>
-              <w:t>{{ row.name.full() }}</w:t>
-            </w:r>
-          </w:p>
-        </w:tc>
-        <w:tc>
-          <w:tcPr>
-            <w:tcW w:w="1304" w:type="dxa"/>
-            <w:tcBorders/>
-          </w:tcPr>
-          <w:p>
-            <w:pPr>
-              <w:pStyle w:val="Normal"/>
-              <w:widowControl w:val="false"/>
-              <w:suppressAutoHyphens w:val="true"/>
-              <w:spacing w:lineRule="auto" w:line="240" w:before="0" w:after="0"/>
-              <w:jc w:val="left"/>
-              <w:rPr>
-                <w:rFonts w:ascii="Helvetica" w:hAnsi="Helvetica"/>
-                <w:sz w:val="24"/>
-                <w:szCs w:val="24"/>
-              </w:rPr>
-            </w:pPr>
-            <w:r>
-              <w:rPr>
-                <w:rFonts w:eastAsia="Calibri" w:cs="Arial" w:ascii="Helvetica" w:hAnsi="Helvetica"/>
-                <w:kern w:val="0"/>
-                <w:sz w:val="24"/>
-                <w:szCs w:val="24"/>
-                <w:lang w:val="en-US" w:eastAsia="en-US" w:bidi="ar-SA"/>
-              </w:rPr>
-              <w:t>$</w:t>
-            </w:r>
-            <w:r>
-              <w:rPr>
-                <w:rFonts w:eastAsia="Calibri" w:cs="Arial" w:ascii="Helvetica" w:hAnsi="Helvetica"/>
-                <w:kern w:val="0"/>
-                <w:sz w:val="24"/>
-                <w:szCs w:val="24"/>
-                <w:lang w:val="en-US" w:eastAsia="en-US" w:bidi="ar-SA"/>
-              </w:rPr>
-              <w:t xml:space="preserve">{{ </w:t>
-            </w:r>
-            <w:r>
-              <w:rPr>
-                <w:rFonts w:eastAsia="Calibri" w:cs="Arial" w:ascii="Helvetica" w:hAnsi="Helvetica"/>
-                <w:kern w:val="0"/>
-                <w:sz w:val="24"/>
-                <w:szCs w:val="24"/>
-                <w:lang w:val="en-US" w:eastAsia="en-US" w:bidi="ar-SA"/>
-              </w:rPr>
-              <w:t>thousands(</w:t>
-            </w:r>
-            <w:r>
-              <w:rPr>
-                <w:rFonts w:eastAsia="Calibri" w:cs="Arial" w:ascii="Helvetica" w:hAnsi="Helvetica"/>
-                <w:kern w:val="0"/>
-                <w:sz w:val="24"/>
-                <w:szCs w:val="24"/>
-                <w:lang w:val="en-US" w:eastAsia="en-US" w:bidi="ar-SA"/>
-              </w:rPr>
-              <w:t>row.</w:t>
-            </w:r>
-            <w:r>
-              <w:rPr>
-                <w:rFonts w:eastAsia="Calibri" w:cs="Arial" w:ascii="Helvetica" w:hAnsi="Helvetica"/>
-                <w:kern w:val="0"/>
-                <w:sz w:val="24"/>
-                <w:szCs w:val="24"/>
-                <w:lang w:val="en-US" w:eastAsia="en-US" w:bidi="ar-SA"/>
-              </w:rPr>
-              <w:t>total(times_per_year=12</w:t>
-            </w:r>
-            <w:r>
-              <w:rPr>
-                <w:rFonts w:eastAsia="Calibri" w:cs="Arial" w:ascii="Helvetica" w:hAnsi="Helvetica"/>
-                <w:kern w:val="0"/>
-                <w:sz w:val="24"/>
-                <w:szCs w:val="24"/>
-                <w:lang w:val="en-US" w:eastAsia="en-US" w:bidi="ar-SA"/>
-              </w:rPr>
-              <w:t>), show_decimals=True</w:t>
-            </w:r>
-            <w:r>
-              <w:rPr>
-                <w:rFonts w:eastAsia="Calibri" w:cs="Arial" w:ascii="Helvetica" w:hAnsi="Helvetica"/>
-                <w:kern w:val="0"/>
-                <w:sz w:val="24"/>
-                <w:szCs w:val="24"/>
-                <w:lang w:val="en-US" w:eastAsia="en-US" w:bidi="ar-SA"/>
-              </w:rPr>
-              <w:t>)</w:t>
-            </w:r>
-            <w:r>
-              <w:rPr>
-                <w:rFonts w:eastAsia="Calibri" w:cs="Arial" w:ascii="Helvetica" w:hAnsi="Helvetica"/>
-                <w:kern w:val="0"/>
-                <w:sz w:val="24"/>
-                <w:szCs w:val="24"/>
-                <w:lang w:val="en-US" w:eastAsia="en-US" w:bidi="ar-SA"/>
-              </w:rPr>
-              <w:t xml:space="preserve"> }} </w:t>
-            </w:r>
-            <w:r>
-              <w:rPr>
-                <w:rFonts w:eastAsia="Calibri" w:cs="Arial" w:ascii="Helvetica" w:hAnsi="Helvetica"/>
-                <w:kern w:val="0"/>
-                <w:sz w:val="24"/>
-                <w:szCs w:val="24"/>
-                <w:lang w:val="en-US" w:eastAsia="en-US" w:bidi="ar-SA"/>
-              </w:rPr>
-              <w:t>per month</w:t>
+            <w:tcW w:w="7754" w:type="dxa"/>
+            <w:tcBorders/>
+          </w:tcPr>
+          <w:p>
+            <w:pPr>
+              <w:pStyle w:val="Normal"/>
+              <w:widowControl w:val="false"/>
+              <w:suppressAutoHyphens w:val="true"/>
+              <w:spacing w:lineRule="auto" w:line="240" w:before="0" w:after="0"/>
+              <w:jc w:val="left"/>
+              <w:rPr>
+                <w:rFonts w:ascii="Helvetica" w:hAnsi="Helvetica"/>
+                <w:sz w:val="24"/>
+                <w:szCs w:val="24"/>
+              </w:rPr>
+            </w:pPr>
+            <w:r>
+              <w:rPr>
+                <w:rFonts w:eastAsia="Calibri" w:cs="Arial" w:ascii="Helvetica" w:hAnsi="Helvetica"/>
+                <w:kern w:val="0"/>
+                <w:sz w:val="24"/>
+                <w:szCs w:val="24"/>
+                <w:lang w:val="en-US" w:eastAsia="en-US" w:bidi="ar-SA"/>
+              </w:rPr>
+              <w:t>{{ row.</w:t>
+            </w:r>
+            <w:r>
+              <w:rPr>
+                <w:rFonts w:eastAsia="Calibri" w:cs="Arial" w:ascii="Helvetica" w:hAnsi="Helvetica"/>
+                <w:kern w:val="0"/>
+                <w:sz w:val="24"/>
+                <w:szCs w:val="24"/>
+                <w:lang w:val="en-US" w:eastAsia="en-US" w:bidi="ar-SA"/>
+              </w:rPr>
+              <w:t>description</w:t>
+            </w:r>
+            <w:r>
+              <w:rPr>
+                <w:rFonts w:eastAsia="Calibri" w:cs="Arial" w:ascii="Helvetica" w:hAnsi="Helvetica"/>
+                <w:kern w:val="0"/>
+                <w:sz w:val="24"/>
+                <w:szCs w:val="24"/>
+                <w:lang w:val="en-US" w:eastAsia="en-US" w:bidi="ar-SA"/>
+              </w:rPr>
+              <w:t xml:space="preserve"> }}</w:t>
+            </w:r>
+          </w:p>
+        </w:tc>
+        <w:tc>
+          <w:tcPr>
+            <w:tcW w:w="1605" w:type="dxa"/>
+            <w:tcBorders/>
+          </w:tcPr>
+          <w:p>
+            <w:pPr>
+              <w:pStyle w:val="Normal"/>
+              <w:widowControl w:val="false"/>
+              <w:suppressAutoHyphens w:val="true"/>
+              <w:spacing w:lineRule="auto" w:line="240" w:before="0" w:after="0"/>
+              <w:jc w:val="left"/>
+              <w:rPr>
+                <w:rFonts w:ascii="Helvetica" w:hAnsi="Helvetica"/>
+                <w:sz w:val="24"/>
+                <w:szCs w:val="24"/>
+              </w:rPr>
+            </w:pPr>
+            <w:r>
+              <w:rPr>
+                <w:rFonts w:eastAsia="Calibri" w:cs="Arial" w:ascii="Helvetica" w:hAnsi="Helvetica"/>
+                <w:kern w:val="0"/>
+                <w:sz w:val="24"/>
+                <w:szCs w:val="24"/>
+                <w:lang w:val="en-US" w:eastAsia="en-US" w:bidi="ar-SA"/>
+              </w:rPr>
+              <w:t>${{ thousands(row.total(times_per_year=12), show_decimals=True) }} per month</w:t>
             </w:r>
           </w:p>
         </w:tc>
@@ -2694,7 +2410,7 @@
         <w:trPr/>
         <w:tc>
           <w:tcPr>
-            <w:tcW w:w="6300" w:type="dxa"/>
+            <w:tcW w:w="7754" w:type="dxa"/>
             <w:tcBorders/>
           </w:tcPr>
           <w:p>
@@ -2724,7 +2440,7 @@
         </w:tc>
         <w:tc>
           <w:tcPr>
-            <w:tcW w:w="1304" w:type="dxa"/>
+            <w:tcW w:w="1605" w:type="dxa"/>
             <w:tcBorders/>
           </w:tcPr>
           <w:p>
@@ -2783,55 +2499,7 @@
           <w:sz w:val="24"/>
           <w:szCs w:val="24"/>
         </w:rPr>
-        <w:t>{%p elif field.field_name in ["support_</w:t>
-      </w:r>
-      <w:r>
-        <w:rPr>
-          <w:rFonts w:ascii="Helvetica" w:hAnsi="Helvetica"/>
-          <w:sz w:val="24"/>
-          <w:szCs w:val="24"/>
-        </w:rPr>
-        <w:t>recipient</w:t>
-      </w:r>
-      <w:r>
-        <w:rPr>
-          <w:rFonts w:ascii="Helvetica" w:hAnsi="Helvetica"/>
-          <w:sz w:val="24"/>
-          <w:szCs w:val="24"/>
-        </w:rPr>
-        <w:t>.extraordinary_</w:t>
-      </w:r>
-      <w:r>
-        <w:rPr>
-          <w:rFonts w:ascii="Helvetica" w:hAnsi="Helvetica"/>
-          <w:sz w:val="24"/>
-          <w:szCs w:val="24"/>
-        </w:rPr>
-        <w:t>medical</w:t>
-      </w:r>
-      <w:r>
-        <w:rPr>
-          <w:rFonts w:ascii="Helvetica" w:hAnsi="Helvetica"/>
-          <w:sz w:val="24"/>
-          <w:szCs w:val="24"/>
-        </w:rPr>
-        <w:t>_costs"</w:t>
-      </w:r>
-      <w:r>
-        <w:rPr>
-          <w:rFonts w:ascii="Helvetica" w:hAnsi="Helvetica"/>
-          <w:sz w:val="24"/>
-          <w:szCs w:val="24"/>
-        </w:rPr>
-        <w:t>]</w:t>
-      </w:r>
-      <w:r>
-        <w:rPr>
-          <w:rFonts w:ascii="Helvetica" w:hAnsi="Helvetica"/>
-          <w:sz w:val="24"/>
-          <w:szCs w:val="24"/>
-        </w:rPr>
-        <w:t xml:space="preserve"> %}</w:t>
+        <w:t>{%p elif field.field_name in ["support_recipient.extraordinary_medical_costs"] %}</w:t>
       </w:r>
     </w:p>
     <w:p>
@@ -2853,55 +2521,7 @@
           <w:sz w:val="24"/>
           <w:szCs w:val="24"/>
         </w:rPr>
-        <w:t>8</w:t>
-      </w:r>
-      <w:r>
-        <w:rPr>
-          <w:rFonts w:cs="Arial" w:ascii="Helvetica" w:hAnsi="Helvetica"/>
-          <w:sz w:val="24"/>
-          <w:szCs w:val="24"/>
-        </w:rPr>
-        <w:t xml:space="preserve">. </w:t>
-      </w:r>
-      <w:r>
-        <w:rPr>
-          <w:rFonts w:cs="Arial" w:ascii="Helvetica" w:hAnsi="Helvetica"/>
-          <w:sz w:val="24"/>
-          <w:szCs w:val="24"/>
-        </w:rPr>
-        <w:t xml:space="preserve">Extraordinary </w:t>
-      </w:r>
-      <w:r>
-        <w:rPr>
-          <w:rFonts w:cs="Arial" w:ascii="Helvetica" w:hAnsi="Helvetica"/>
-          <w:sz w:val="24"/>
-          <w:szCs w:val="24"/>
-        </w:rPr>
-        <w:t xml:space="preserve">Medical </w:t>
-      </w:r>
-      <w:r>
-        <w:rPr>
-          <w:rFonts w:cs="Arial" w:ascii="Helvetica" w:hAnsi="Helvetica"/>
-          <w:sz w:val="24"/>
-          <w:szCs w:val="24"/>
-        </w:rPr>
-        <w:t>Costs for {{ support_</w:t>
-      </w:r>
-      <w:r>
-        <w:rPr>
-          <w:rFonts w:cs="Arial" w:ascii="Helvetica" w:hAnsi="Helvetica"/>
-          <w:sz w:val="24"/>
-          <w:szCs w:val="24"/>
-        </w:rPr>
-        <w:t>recipient</w:t>
-      </w:r>
-      <w:r>
-        <w:rPr>
-          <w:rFonts w:cs="Arial" w:ascii="Helvetica" w:hAnsi="Helvetica"/>
-          <w:sz w:val="24"/>
-          <w:szCs w:val="24"/>
-        </w:rPr>
-        <w:t xml:space="preserve">.name_full() }} </w:t>
+        <w:t xml:space="preserve">8. Extraordinary Medical Costs for {{ support_recipient.name_full() }} </w:t>
       </w:r>
     </w:p>
     <w:tbl>
@@ -2920,14 +2540,14 @@
         <w:tblLook w:val="04a0" w:noHBand="0" w:noVBand="1" w:firstColumn="1" w:lastRow="0" w:lastColumn="0" w:firstRow="1"/>
       </w:tblPr>
       <w:tblGrid>
-        <w:gridCol w:w="6300"/>
-        <w:gridCol w:w="1304"/>
+        <w:gridCol w:w="7754"/>
+        <w:gridCol w:w="1605"/>
       </w:tblGrid>
       <w:tr>
         <w:trPr/>
         <w:tc>
           <w:tcPr>
-            <w:tcW w:w="6300" w:type="dxa"/>
+            <w:tcW w:w="7754" w:type="dxa"/>
             <w:tcBorders/>
           </w:tcPr>
           <w:p>
@@ -2958,7 +2578,7 @@
         </w:tc>
         <w:tc>
           <w:tcPr>
-            <w:tcW w:w="1304" w:type="dxa"/>
+            <w:tcW w:w="1605" w:type="dxa"/>
             <w:tcBorders/>
           </w:tcPr>
           <w:p>
@@ -2992,7 +2612,7 @@
         <w:trPr/>
         <w:tc>
           <w:tcPr>
-            <w:tcW w:w="6300" w:type="dxa"/>
+            <w:tcW w:w="7754" w:type="dxa"/>
             <w:tcBorders/>
           </w:tcPr>
           <w:p>
@@ -3022,7 +2642,7 @@
         </w:tc>
         <w:tc>
           <w:tcPr>
-            <w:tcW w:w="1304" w:type="dxa"/>
+            <w:tcW w:w="1605" w:type="dxa"/>
             <w:tcBorders/>
           </w:tcPr>
           <w:p>
@@ -3052,141 +2672,81 @@
         <w:trPr/>
         <w:tc>
           <w:tcPr>
-            <w:tcW w:w="6300" w:type="dxa"/>
-            <w:tcBorders/>
-          </w:tcPr>
-          <w:p>
-            <w:pPr>
-              <w:pStyle w:val="Normal"/>
-              <w:widowControl w:val="false"/>
-              <w:suppressAutoHyphens w:val="true"/>
-              <w:spacing w:lineRule="auto" w:line="240" w:before="0" w:after="0"/>
-              <w:jc w:val="left"/>
-              <w:rPr>
-                <w:rFonts w:ascii="Helvetica" w:hAnsi="Helvetica"/>
-                <w:sz w:val="24"/>
-                <w:szCs w:val="24"/>
-              </w:rPr>
-            </w:pPr>
-            <w:r>
-              <w:rPr>
-                <w:rFonts w:eastAsia="Calibri" w:cs="Arial" w:ascii="Helvetica" w:hAnsi="Helvetica"/>
-                <w:kern w:val="0"/>
-                <w:sz w:val="24"/>
-                <w:szCs w:val="24"/>
-                <w:lang w:val="en-US" w:eastAsia="en-US" w:bidi="ar-SA"/>
-              </w:rPr>
-              <w:t>{{ row.name.full() }}</w:t>
-            </w:r>
-          </w:p>
-        </w:tc>
-        <w:tc>
-          <w:tcPr>
-            <w:tcW w:w="1304" w:type="dxa"/>
-            <w:tcBorders/>
-          </w:tcPr>
-          <w:p>
-            <w:pPr>
-              <w:pStyle w:val="Normal"/>
-              <w:widowControl w:val="false"/>
-              <w:suppressAutoHyphens w:val="true"/>
-              <w:spacing w:lineRule="auto" w:line="240" w:before="0" w:after="0"/>
-              <w:jc w:val="left"/>
-              <w:rPr>
-                <w:rFonts w:ascii="Helvetica" w:hAnsi="Helvetica"/>
-                <w:sz w:val="24"/>
-                <w:szCs w:val="24"/>
-              </w:rPr>
-            </w:pPr>
-            <w:r>
-              <w:rPr>
-                <w:rFonts w:eastAsia="Calibri" w:cs="Arial" w:ascii="Helvetica" w:hAnsi="Helvetica"/>
-                <w:kern w:val="0"/>
-                <w:sz w:val="24"/>
-                <w:szCs w:val="24"/>
-                <w:lang w:val="en-US" w:eastAsia="en-US" w:bidi="ar-SA"/>
-              </w:rPr>
-              <w:t>$</w:t>
-            </w:r>
-            <w:r>
-              <w:rPr>
-                <w:rFonts w:eastAsia="Calibri" w:cs="Arial" w:ascii="Helvetica" w:hAnsi="Helvetica"/>
-                <w:kern w:val="0"/>
-                <w:sz w:val="24"/>
-                <w:szCs w:val="24"/>
-                <w:lang w:val="en-US" w:eastAsia="en-US" w:bidi="ar-SA"/>
-              </w:rPr>
-              <w:t xml:space="preserve">{{ </w:t>
-            </w:r>
-            <w:r>
-              <w:rPr>
-                <w:rFonts w:eastAsia="Calibri" w:cs="Arial" w:ascii="Helvetica" w:hAnsi="Helvetica"/>
-                <w:kern w:val="0"/>
-                <w:sz w:val="24"/>
-                <w:szCs w:val="24"/>
-                <w:lang w:val="en-US" w:eastAsia="en-US" w:bidi="ar-SA"/>
-              </w:rPr>
-              <w:t>thousands(</w:t>
-            </w:r>
-            <w:r>
-              <w:rPr>
-                <w:rFonts w:eastAsia="Calibri" w:cs="Arial" w:ascii="Helvetica" w:hAnsi="Helvetica"/>
-                <w:kern w:val="0"/>
-                <w:sz w:val="24"/>
-                <w:szCs w:val="24"/>
-                <w:lang w:val="en-US" w:eastAsia="en-US" w:bidi="ar-SA"/>
-              </w:rPr>
-              <w:t>row.</w:t>
-            </w:r>
-            <w:r>
-              <w:rPr>
-                <w:rFonts w:eastAsia="Calibri" w:cs="Arial" w:ascii="Helvetica" w:hAnsi="Helvetica"/>
-                <w:kern w:val="0"/>
-                <w:sz w:val="24"/>
-                <w:szCs w:val="24"/>
-                <w:lang w:val="en-US" w:eastAsia="en-US" w:bidi="ar-SA"/>
-              </w:rPr>
-              <w:t>total(times_per_year=12</w:t>
-            </w:r>
-            <w:r>
-              <w:rPr>
-                <w:rFonts w:eastAsia="Calibri" w:cs="Arial" w:ascii="Helvetica" w:hAnsi="Helvetica"/>
-                <w:kern w:val="0"/>
-                <w:sz w:val="24"/>
-                <w:szCs w:val="24"/>
-                <w:lang w:val="en-US" w:eastAsia="en-US" w:bidi="ar-SA"/>
-              </w:rPr>
-              <w:t>), show_decimals=True</w:t>
-            </w:r>
-            <w:r>
-              <w:rPr>
-                <w:rFonts w:eastAsia="Calibri" w:cs="Arial" w:ascii="Helvetica" w:hAnsi="Helvetica"/>
-                <w:kern w:val="0"/>
-                <w:sz w:val="24"/>
-                <w:szCs w:val="24"/>
-                <w:lang w:val="en-US" w:eastAsia="en-US" w:bidi="ar-SA"/>
-              </w:rPr>
-              <w:t>)</w:t>
-            </w:r>
-            <w:r>
-              <w:rPr>
-                <w:rFonts w:eastAsia="Calibri" w:cs="Arial" w:ascii="Helvetica" w:hAnsi="Helvetica"/>
-                <w:kern w:val="0"/>
-                <w:sz w:val="24"/>
-                <w:szCs w:val="24"/>
-                <w:lang w:val="en-US" w:eastAsia="en-US" w:bidi="ar-SA"/>
-              </w:rPr>
-              <w:t xml:space="preserve"> }} </w:t>
-            </w:r>
-            <w:r>
-              <w:rPr>
-                <w:rFonts w:eastAsia="Calibri" w:cs="Arial" w:ascii="Helvetica" w:hAnsi="Helvetica"/>
-                <w:kern w:val="0"/>
-                <w:sz w:val="24"/>
-                <w:szCs w:val="24"/>
-                <w:lang w:val="en-US" w:eastAsia="en-US" w:bidi="ar-SA"/>
-              </w:rPr>
-              <w:t>per month</w:t>
+            <w:tcW w:w="7754" w:type="dxa"/>
+            <w:tcBorders/>
+          </w:tcPr>
+          <w:p>
+            <w:pPr>
+              <w:pStyle w:val="Normal"/>
+              <w:widowControl w:val="false"/>
+              <w:suppressAutoHyphens w:val="true"/>
+              <w:spacing w:lineRule="auto" w:line="240" w:before="0" w:after="0"/>
+              <w:jc w:val="left"/>
+              <w:rPr>
+                <w:rFonts w:ascii="Helvetica" w:hAnsi="Helvetica"/>
+                <w:sz w:val="24"/>
+                <w:szCs w:val="24"/>
+              </w:rPr>
+            </w:pPr>
+            <w:r>
+              <w:rPr>
+                <w:rFonts w:eastAsia="Calibri" w:cs="Arial" w:ascii="Helvetica" w:hAnsi="Helvetica"/>
+                <w:kern w:val="0"/>
+                <w:sz w:val="24"/>
+                <w:szCs w:val="24"/>
+                <w:lang w:val="en-US" w:eastAsia="en-US" w:bidi="ar-SA"/>
+              </w:rPr>
+              <w:t>{{ row.</w:t>
+            </w:r>
+            <w:r>
+              <w:rPr>
+                <w:rFonts w:eastAsia="Calibri" w:cs="Arial" w:ascii="Helvetica" w:hAnsi="Helvetica"/>
+                <w:kern w:val="0"/>
+                <w:sz w:val="24"/>
+                <w:szCs w:val="24"/>
+                <w:lang w:val="en-US" w:eastAsia="en-US" w:bidi="ar-SA"/>
+              </w:rPr>
+              <w:t>description</w:t>
+            </w:r>
+            <w:r>
+              <w:rPr>
+                <w:rFonts w:eastAsia="Calibri" w:cs="Arial" w:ascii="Helvetica" w:hAnsi="Helvetica"/>
+                <w:kern w:val="0"/>
+                <w:sz w:val="24"/>
+                <w:szCs w:val="24"/>
+                <w:lang w:val="en-US" w:eastAsia="en-US" w:bidi="ar-SA"/>
+              </w:rPr>
+              <w:t xml:space="preserve"> }}</w:t>
+            </w:r>
+          </w:p>
+        </w:tc>
+        <w:tc>
+          <w:tcPr>
+            <w:tcW w:w="1605" w:type="dxa"/>
+            <w:tcBorders/>
+          </w:tcPr>
+          <w:p>
+            <w:pPr>
+              <w:pStyle w:val="Normal"/>
+              <w:widowControl w:val="false"/>
+              <w:suppressAutoHyphens w:val="true"/>
+              <w:spacing w:lineRule="auto" w:line="240" w:before="0" w:after="0"/>
+              <w:jc w:val="left"/>
+              <w:rPr>
+                <w:rFonts w:ascii="Helvetica" w:hAnsi="Helvetica"/>
+                <w:sz w:val="24"/>
+                <w:szCs w:val="24"/>
+              </w:rPr>
+            </w:pPr>
+            <w:r>
+              <w:rPr>
+                <w:rFonts w:eastAsia="Calibri" w:cs="Arial" w:ascii="Helvetica" w:hAnsi="Helvetica"/>
+                <w:kern w:val="0"/>
+                <w:sz w:val="24"/>
+                <w:szCs w:val="24"/>
+                <w:lang w:val="en-US" w:eastAsia="en-US" w:bidi="ar-SA"/>
+              </w:rPr>
+              <w:t>${{ thousands(row.total(times_per_year=12), show_decimals=True) }} per month</w:t>
             </w:r>
           </w:p>
         </w:tc>
@@ -3195,7 +2755,7 @@
         <w:trPr/>
         <w:tc>
           <w:tcPr>
-            <w:tcW w:w="6300" w:type="dxa"/>
+            <w:tcW w:w="7754" w:type="dxa"/>
             <w:tcBorders/>
           </w:tcPr>
           <w:p>
@@ -3225,7 +2785,7 @@
         </w:tc>
         <w:tc>
           <w:tcPr>
-            <w:tcW w:w="1304" w:type="dxa"/>
+            <w:tcW w:w="1605" w:type="dxa"/>
             <w:tcBorders/>
           </w:tcPr>
           <w:p>
@@ -3284,23 +2844,7 @@
           <w:sz w:val="24"/>
           <w:szCs w:val="24"/>
         </w:rPr>
-        <w:t>{%p elif field.field_name in [ "support_recipient.extraordinary_childre</w:t>
-      </w:r>
-      <w:r>
-        <w:rPr>
-          <w:rFonts w:ascii="Helvetica" w:hAnsi="Helvetica"/>
-          <w:sz w:val="24"/>
-          <w:szCs w:val="24"/>
-        </w:rPr>
-        <w:t>aring</w:t>
-      </w:r>
-      <w:r>
-        <w:rPr>
-          <w:rFonts w:ascii="Helvetica" w:hAnsi="Helvetica"/>
-          <w:sz w:val="24"/>
-          <w:szCs w:val="24"/>
-        </w:rPr>
-        <w:t>_costs_in_14"] %}</w:t>
+        <w:t>{%p elif field.field_name in [ "support_recipient.extraordinary_childrearing_costs_in_14"] %}</w:t>
       </w:r>
     </w:p>
     <w:p>
@@ -3322,39 +2866,7 @@
           <w:sz w:val="24"/>
           <w:szCs w:val="24"/>
         </w:rPr>
-        <w:t>13a</w:t>
-      </w:r>
-      <w:r>
-        <w:rPr>
-          <w:rFonts w:cs="Arial" w:ascii="Helvetica" w:hAnsi="Helvetica"/>
-          <w:sz w:val="24"/>
-          <w:szCs w:val="24"/>
-        </w:rPr>
-        <w:t xml:space="preserve">. </w:t>
-      </w:r>
-      <w:r>
-        <w:rPr>
-          <w:rFonts w:cs="Arial" w:ascii="Helvetica" w:hAnsi="Helvetica"/>
-          <w:sz w:val="24"/>
-          <w:szCs w:val="24"/>
-        </w:rPr>
-        <w:t>Extraordinary Childrearing Costs for {{ support_</w:t>
-      </w:r>
-      <w:r>
-        <w:rPr>
-          <w:rFonts w:cs="Arial" w:ascii="Helvetica" w:hAnsi="Helvetica"/>
-          <w:sz w:val="24"/>
-          <w:szCs w:val="24"/>
-        </w:rPr>
-        <w:t>recipient.</w:t>
-      </w:r>
-      <w:r>
-        <w:rPr>
-          <w:rFonts w:cs="Arial" w:ascii="Helvetica" w:hAnsi="Helvetica"/>
-          <w:sz w:val="24"/>
-          <w:szCs w:val="24"/>
-        </w:rPr>
-        <w:t>name_full() }} included in Form 14</w:t>
+        <w:t>13a. Extraordinary Childrearing Costs for {{ support_recipient.name_full() }} included in Form 14</w:t>
       </w:r>
     </w:p>
     <w:tbl>
@@ -3373,14 +2885,14 @@
         <w:tblLook w:val="04a0" w:noHBand="0" w:noVBand="1" w:firstColumn="1" w:lastRow="0" w:lastColumn="0" w:firstRow="1"/>
       </w:tblPr>
       <w:tblGrid>
-        <w:gridCol w:w="6300"/>
-        <w:gridCol w:w="1304"/>
+        <w:gridCol w:w="7754"/>
+        <w:gridCol w:w="1605"/>
       </w:tblGrid>
       <w:tr>
         <w:trPr/>
         <w:tc>
           <w:tcPr>
-            <w:tcW w:w="6300" w:type="dxa"/>
+            <w:tcW w:w="7754" w:type="dxa"/>
             <w:tcBorders/>
           </w:tcPr>
           <w:p>
@@ -3411,7 +2923,7 @@
         </w:tc>
         <w:tc>
           <w:tcPr>
-            <w:tcW w:w="1304" w:type="dxa"/>
+            <w:tcW w:w="1605" w:type="dxa"/>
             <w:tcBorders/>
           </w:tcPr>
           <w:p>
@@ -3445,7 +2957,7 @@
         <w:trPr/>
         <w:tc>
           <w:tcPr>
-            <w:tcW w:w="6300" w:type="dxa"/>
+            <w:tcW w:w="7754" w:type="dxa"/>
             <w:tcBorders/>
           </w:tcPr>
           <w:p>
@@ -3475,7 +2987,7 @@
         </w:tc>
         <w:tc>
           <w:tcPr>
-            <w:tcW w:w="1304" w:type="dxa"/>
+            <w:tcW w:w="1605" w:type="dxa"/>
             <w:tcBorders/>
           </w:tcPr>
           <w:p>
@@ -3505,141 +3017,81 @@
         <w:trPr/>
         <w:tc>
           <w:tcPr>
-            <w:tcW w:w="6300" w:type="dxa"/>
-            <w:tcBorders/>
-          </w:tcPr>
-          <w:p>
-            <w:pPr>
-              <w:pStyle w:val="Normal"/>
-              <w:widowControl w:val="false"/>
-              <w:suppressAutoHyphens w:val="true"/>
-              <w:spacing w:lineRule="auto" w:line="240" w:before="0" w:after="0"/>
-              <w:jc w:val="left"/>
-              <w:rPr>
-                <w:rFonts w:ascii="Helvetica" w:hAnsi="Helvetica"/>
-                <w:sz w:val="24"/>
-                <w:szCs w:val="24"/>
-              </w:rPr>
-            </w:pPr>
-            <w:r>
-              <w:rPr>
-                <w:rFonts w:eastAsia="Calibri" w:cs="Arial" w:ascii="Helvetica" w:hAnsi="Helvetica"/>
-                <w:kern w:val="0"/>
-                <w:sz w:val="24"/>
-                <w:szCs w:val="24"/>
-                <w:lang w:val="en-US" w:eastAsia="en-US" w:bidi="ar-SA"/>
-              </w:rPr>
-              <w:t>{{ row.name.full() }}</w:t>
-            </w:r>
-          </w:p>
-        </w:tc>
-        <w:tc>
-          <w:tcPr>
-            <w:tcW w:w="1304" w:type="dxa"/>
-            <w:tcBorders/>
-          </w:tcPr>
-          <w:p>
-            <w:pPr>
-              <w:pStyle w:val="Normal"/>
-              <w:widowControl w:val="false"/>
-              <w:suppressAutoHyphens w:val="true"/>
-              <w:spacing w:lineRule="auto" w:line="240" w:before="0" w:after="0"/>
-              <w:jc w:val="left"/>
-              <w:rPr>
-                <w:rFonts w:ascii="Helvetica" w:hAnsi="Helvetica"/>
-                <w:sz w:val="24"/>
-                <w:szCs w:val="24"/>
-              </w:rPr>
-            </w:pPr>
-            <w:r>
-              <w:rPr>
-                <w:rFonts w:eastAsia="Calibri" w:cs="Arial" w:ascii="Helvetica" w:hAnsi="Helvetica"/>
-                <w:kern w:val="0"/>
-                <w:sz w:val="24"/>
-                <w:szCs w:val="24"/>
-                <w:lang w:val="en-US" w:eastAsia="en-US" w:bidi="ar-SA"/>
-              </w:rPr>
-              <w:t>$</w:t>
-            </w:r>
-            <w:r>
-              <w:rPr>
-                <w:rFonts w:eastAsia="Calibri" w:cs="Arial" w:ascii="Helvetica" w:hAnsi="Helvetica"/>
-                <w:kern w:val="0"/>
-                <w:sz w:val="24"/>
-                <w:szCs w:val="24"/>
-                <w:lang w:val="en-US" w:eastAsia="en-US" w:bidi="ar-SA"/>
-              </w:rPr>
-              <w:t xml:space="preserve">{{ </w:t>
-            </w:r>
-            <w:r>
-              <w:rPr>
-                <w:rFonts w:eastAsia="Calibri" w:cs="Arial" w:ascii="Helvetica" w:hAnsi="Helvetica"/>
-                <w:kern w:val="0"/>
-                <w:sz w:val="24"/>
-                <w:szCs w:val="24"/>
-                <w:lang w:val="en-US" w:eastAsia="en-US" w:bidi="ar-SA"/>
-              </w:rPr>
-              <w:t>thousands(</w:t>
-            </w:r>
-            <w:r>
-              <w:rPr>
-                <w:rFonts w:eastAsia="Calibri" w:cs="Arial" w:ascii="Helvetica" w:hAnsi="Helvetica"/>
-                <w:kern w:val="0"/>
-                <w:sz w:val="24"/>
-                <w:szCs w:val="24"/>
-                <w:lang w:val="en-US" w:eastAsia="en-US" w:bidi="ar-SA"/>
-              </w:rPr>
-              <w:t>row.</w:t>
-            </w:r>
-            <w:r>
-              <w:rPr>
-                <w:rFonts w:eastAsia="Calibri" w:cs="Arial" w:ascii="Helvetica" w:hAnsi="Helvetica"/>
-                <w:kern w:val="0"/>
-                <w:sz w:val="24"/>
-                <w:szCs w:val="24"/>
-                <w:lang w:val="en-US" w:eastAsia="en-US" w:bidi="ar-SA"/>
-              </w:rPr>
-              <w:t>total(times_per_year=12</w:t>
-            </w:r>
-            <w:r>
-              <w:rPr>
-                <w:rFonts w:eastAsia="Calibri" w:cs="Arial" w:ascii="Helvetica" w:hAnsi="Helvetica"/>
-                <w:kern w:val="0"/>
-                <w:sz w:val="24"/>
-                <w:szCs w:val="24"/>
-                <w:lang w:val="en-US" w:eastAsia="en-US" w:bidi="ar-SA"/>
-              </w:rPr>
-              <w:t>), show_decimals=True</w:t>
-            </w:r>
-            <w:r>
-              <w:rPr>
-                <w:rFonts w:eastAsia="Calibri" w:cs="Arial" w:ascii="Helvetica" w:hAnsi="Helvetica"/>
-                <w:kern w:val="0"/>
-                <w:sz w:val="24"/>
-                <w:szCs w:val="24"/>
-                <w:lang w:val="en-US" w:eastAsia="en-US" w:bidi="ar-SA"/>
-              </w:rPr>
-              <w:t>)</w:t>
-            </w:r>
-            <w:r>
-              <w:rPr>
-                <w:rFonts w:eastAsia="Calibri" w:cs="Arial" w:ascii="Helvetica" w:hAnsi="Helvetica"/>
-                <w:kern w:val="0"/>
-                <w:sz w:val="24"/>
-                <w:szCs w:val="24"/>
-                <w:lang w:val="en-US" w:eastAsia="en-US" w:bidi="ar-SA"/>
-              </w:rPr>
-              <w:t xml:space="preserve"> }} </w:t>
-            </w:r>
-            <w:r>
-              <w:rPr>
-                <w:rFonts w:eastAsia="Calibri" w:cs="Arial" w:ascii="Helvetica" w:hAnsi="Helvetica"/>
-                <w:kern w:val="0"/>
-                <w:sz w:val="24"/>
-                <w:szCs w:val="24"/>
-                <w:lang w:val="en-US" w:eastAsia="en-US" w:bidi="ar-SA"/>
-              </w:rPr>
-              <w:t>per month</w:t>
+            <w:tcW w:w="7754" w:type="dxa"/>
+            <w:tcBorders/>
+          </w:tcPr>
+          <w:p>
+            <w:pPr>
+              <w:pStyle w:val="Normal"/>
+              <w:widowControl w:val="false"/>
+              <w:suppressAutoHyphens w:val="true"/>
+              <w:spacing w:lineRule="auto" w:line="240" w:before="0" w:after="0"/>
+              <w:jc w:val="left"/>
+              <w:rPr>
+                <w:rFonts w:ascii="Helvetica" w:hAnsi="Helvetica"/>
+                <w:sz w:val="24"/>
+                <w:szCs w:val="24"/>
+              </w:rPr>
+            </w:pPr>
+            <w:r>
+              <w:rPr>
+                <w:rFonts w:eastAsia="Calibri" w:cs="Arial" w:ascii="Helvetica" w:hAnsi="Helvetica"/>
+                <w:kern w:val="0"/>
+                <w:sz w:val="24"/>
+                <w:szCs w:val="24"/>
+                <w:lang w:val="en-US" w:eastAsia="en-US" w:bidi="ar-SA"/>
+              </w:rPr>
+              <w:t>{{ row.</w:t>
+            </w:r>
+            <w:r>
+              <w:rPr>
+                <w:rFonts w:eastAsia="Calibri" w:cs="Arial" w:ascii="Helvetica" w:hAnsi="Helvetica"/>
+                <w:kern w:val="0"/>
+                <w:sz w:val="24"/>
+                <w:szCs w:val="24"/>
+                <w:lang w:val="en-US" w:eastAsia="en-US" w:bidi="ar-SA"/>
+              </w:rPr>
+              <w:t>description</w:t>
+            </w:r>
+            <w:r>
+              <w:rPr>
+                <w:rFonts w:eastAsia="Calibri" w:cs="Arial" w:ascii="Helvetica" w:hAnsi="Helvetica"/>
+                <w:kern w:val="0"/>
+                <w:sz w:val="24"/>
+                <w:szCs w:val="24"/>
+                <w:lang w:val="en-US" w:eastAsia="en-US" w:bidi="ar-SA"/>
+              </w:rPr>
+              <w:t xml:space="preserve"> }}</w:t>
+            </w:r>
+          </w:p>
+        </w:tc>
+        <w:tc>
+          <w:tcPr>
+            <w:tcW w:w="1605" w:type="dxa"/>
+            <w:tcBorders/>
+          </w:tcPr>
+          <w:p>
+            <w:pPr>
+              <w:pStyle w:val="Normal"/>
+              <w:widowControl w:val="false"/>
+              <w:suppressAutoHyphens w:val="true"/>
+              <w:spacing w:lineRule="auto" w:line="240" w:before="0" w:after="0"/>
+              <w:jc w:val="left"/>
+              <w:rPr>
+                <w:rFonts w:ascii="Helvetica" w:hAnsi="Helvetica"/>
+                <w:sz w:val="24"/>
+                <w:szCs w:val="24"/>
+              </w:rPr>
+            </w:pPr>
+            <w:r>
+              <w:rPr>
+                <w:rFonts w:eastAsia="Calibri" w:cs="Arial" w:ascii="Helvetica" w:hAnsi="Helvetica"/>
+                <w:kern w:val="0"/>
+                <w:sz w:val="24"/>
+                <w:szCs w:val="24"/>
+                <w:lang w:val="en-US" w:eastAsia="en-US" w:bidi="ar-SA"/>
+              </w:rPr>
+              <w:t>${{ thousands(row.total(times_per_year=12), show_decimals=True) }} per month</w:t>
             </w:r>
           </w:p>
         </w:tc>
@@ -3648,7 +3100,7 @@
         <w:trPr/>
         <w:tc>
           <w:tcPr>
-            <w:tcW w:w="6300" w:type="dxa"/>
+            <w:tcW w:w="7754" w:type="dxa"/>
             <w:tcBorders/>
           </w:tcPr>
           <w:p>
@@ -3678,7 +3130,7 @@
         </w:tc>
         <w:tc>
           <w:tcPr>
-            <w:tcW w:w="1304" w:type="dxa"/>
+            <w:tcW w:w="1605" w:type="dxa"/>
             <w:tcBorders/>
           </w:tcPr>
           <w:p>
@@ -3737,39 +3189,7 @@
           <w:sz w:val="24"/>
           <w:szCs w:val="24"/>
         </w:rPr>
-        <w:t>{%p elif field.field_name in ["support_payer.extraordinary_child</w:t>
-      </w:r>
-      <w:r>
-        <w:rPr>
-          <w:rFonts w:ascii="Helvetica" w:hAnsi="Helvetica"/>
-          <w:sz w:val="24"/>
-          <w:szCs w:val="24"/>
-        </w:rPr>
-        <w:t>rearing</w:t>
-      </w:r>
-      <w:r>
-        <w:rPr>
-          <w:rFonts w:ascii="Helvetica" w:hAnsi="Helvetica"/>
-          <w:sz w:val="24"/>
-          <w:szCs w:val="24"/>
-        </w:rPr>
-        <w:t>_costs_in_14"</w:t>
-      </w:r>
-      <w:r>
-        <w:rPr>
-          <w:rFonts w:ascii="Helvetica" w:hAnsi="Helvetica"/>
-          <w:sz w:val="24"/>
-          <w:szCs w:val="24"/>
-        </w:rPr>
-        <w:t>]</w:t>
-      </w:r>
-      <w:r>
-        <w:rPr>
-          <w:rFonts w:ascii="Helvetica" w:hAnsi="Helvetica"/>
-          <w:sz w:val="24"/>
-          <w:szCs w:val="24"/>
-        </w:rPr>
-        <w:t xml:space="preserve"> %}</w:t>
+        <w:t>{%p elif field.field_name in ["support_payer.extraordinary_childrearing_costs_in_14"] %}</w:t>
       </w:r>
     </w:p>
     <w:p>
@@ -3791,23 +3211,7 @@
           <w:sz w:val="24"/>
           <w:szCs w:val="24"/>
         </w:rPr>
-        <w:t>13a</w:t>
-      </w:r>
-      <w:r>
-        <w:rPr>
-          <w:rFonts w:cs="Arial" w:ascii="Helvetica" w:hAnsi="Helvetica"/>
-          <w:sz w:val="24"/>
-          <w:szCs w:val="24"/>
-        </w:rPr>
-        <w:t xml:space="preserve">. </w:t>
-      </w:r>
-      <w:r>
-        <w:rPr>
-          <w:rFonts w:cs="Arial" w:ascii="Helvetica" w:hAnsi="Helvetica"/>
-          <w:sz w:val="24"/>
-          <w:szCs w:val="24"/>
-        </w:rPr>
-        <w:t>Extraordinary Childrearing Costs for {{ support_payer.name_full() }} included in Form 14</w:t>
+        <w:t>13a. Extraordinary Childrearing Costs for {{ support_payer.name_full() }} included in Form 14</w:t>
       </w:r>
     </w:p>
     <w:tbl>
@@ -3826,14 +3230,14 @@
         <w:tblLook w:val="04a0" w:noHBand="0" w:noVBand="1" w:firstColumn="1" w:lastRow="0" w:lastColumn="0" w:firstRow="1"/>
       </w:tblPr>
       <w:tblGrid>
-        <w:gridCol w:w="6300"/>
-        <w:gridCol w:w="1304"/>
+        <w:gridCol w:w="7754"/>
+        <w:gridCol w:w="1605"/>
       </w:tblGrid>
       <w:tr>
         <w:trPr/>
         <w:tc>
           <w:tcPr>
-            <w:tcW w:w="6300" w:type="dxa"/>
+            <w:tcW w:w="7754" w:type="dxa"/>
             <w:tcBorders/>
           </w:tcPr>
           <w:p>
@@ -3864,7 +3268,7 @@
         </w:tc>
         <w:tc>
           <w:tcPr>
-            <w:tcW w:w="1304" w:type="dxa"/>
+            <w:tcW w:w="1605" w:type="dxa"/>
             <w:tcBorders/>
           </w:tcPr>
           <w:p>
@@ -3898,7 +3302,7 @@
         <w:trPr/>
         <w:tc>
           <w:tcPr>
-            <w:tcW w:w="6300" w:type="dxa"/>
+            <w:tcW w:w="7754" w:type="dxa"/>
             <w:tcBorders/>
           </w:tcPr>
           <w:p>
@@ -3928,7 +3332,7 @@
         </w:tc>
         <w:tc>
           <w:tcPr>
-            <w:tcW w:w="1304" w:type="dxa"/>
+            <w:tcW w:w="1605" w:type="dxa"/>
             <w:tcBorders/>
           </w:tcPr>
           <w:p>
@@ -3958,141 +3362,81 @@
         <w:trPr/>
         <w:tc>
           <w:tcPr>
-            <w:tcW w:w="6300" w:type="dxa"/>
-            <w:tcBorders/>
-          </w:tcPr>
-          <w:p>
-            <w:pPr>
-              <w:pStyle w:val="Normal"/>
-              <w:widowControl w:val="false"/>
-              <w:suppressAutoHyphens w:val="true"/>
-              <w:spacing w:lineRule="auto" w:line="240" w:before="0" w:after="0"/>
-              <w:jc w:val="left"/>
-              <w:rPr>
-                <w:rFonts w:ascii="Helvetica" w:hAnsi="Helvetica"/>
-                <w:sz w:val="24"/>
-                <w:szCs w:val="24"/>
-              </w:rPr>
-            </w:pPr>
-            <w:r>
-              <w:rPr>
-                <w:rFonts w:eastAsia="Calibri" w:cs="Arial" w:ascii="Helvetica" w:hAnsi="Helvetica"/>
-                <w:kern w:val="0"/>
-                <w:sz w:val="24"/>
-                <w:szCs w:val="24"/>
-                <w:lang w:val="en-US" w:eastAsia="en-US" w:bidi="ar-SA"/>
-              </w:rPr>
-              <w:t>{{ row.name.full() }}</w:t>
-            </w:r>
-          </w:p>
-        </w:tc>
-        <w:tc>
-          <w:tcPr>
-            <w:tcW w:w="1304" w:type="dxa"/>
-            <w:tcBorders/>
-          </w:tcPr>
-          <w:p>
-            <w:pPr>
-              <w:pStyle w:val="Normal"/>
-              <w:widowControl w:val="false"/>
-              <w:suppressAutoHyphens w:val="true"/>
-              <w:spacing w:lineRule="auto" w:line="240" w:before="0" w:after="0"/>
-              <w:jc w:val="left"/>
-              <w:rPr>
-                <w:rFonts w:ascii="Helvetica" w:hAnsi="Helvetica"/>
-                <w:sz w:val="24"/>
-                <w:szCs w:val="24"/>
-              </w:rPr>
-            </w:pPr>
-            <w:r>
-              <w:rPr>
-                <w:rFonts w:eastAsia="Calibri" w:cs="Arial" w:ascii="Helvetica" w:hAnsi="Helvetica"/>
-                <w:kern w:val="0"/>
-                <w:sz w:val="24"/>
-                <w:szCs w:val="24"/>
-                <w:lang w:val="en-US" w:eastAsia="en-US" w:bidi="ar-SA"/>
-              </w:rPr>
-              <w:t>$</w:t>
-            </w:r>
-            <w:r>
-              <w:rPr>
-                <w:rFonts w:eastAsia="Calibri" w:cs="Arial" w:ascii="Helvetica" w:hAnsi="Helvetica"/>
-                <w:kern w:val="0"/>
-                <w:sz w:val="24"/>
-                <w:szCs w:val="24"/>
-                <w:lang w:val="en-US" w:eastAsia="en-US" w:bidi="ar-SA"/>
-              </w:rPr>
-              <w:t xml:space="preserve">{{ </w:t>
-            </w:r>
-            <w:r>
-              <w:rPr>
-                <w:rFonts w:eastAsia="Calibri" w:cs="Arial" w:ascii="Helvetica" w:hAnsi="Helvetica"/>
-                <w:kern w:val="0"/>
-                <w:sz w:val="24"/>
-                <w:szCs w:val="24"/>
-                <w:lang w:val="en-US" w:eastAsia="en-US" w:bidi="ar-SA"/>
-              </w:rPr>
-              <w:t>thousands(</w:t>
-            </w:r>
-            <w:r>
-              <w:rPr>
-                <w:rFonts w:eastAsia="Calibri" w:cs="Arial" w:ascii="Helvetica" w:hAnsi="Helvetica"/>
-                <w:kern w:val="0"/>
-                <w:sz w:val="24"/>
-                <w:szCs w:val="24"/>
-                <w:lang w:val="en-US" w:eastAsia="en-US" w:bidi="ar-SA"/>
-              </w:rPr>
-              <w:t>row.</w:t>
-            </w:r>
-            <w:r>
-              <w:rPr>
-                <w:rFonts w:eastAsia="Calibri" w:cs="Arial" w:ascii="Helvetica" w:hAnsi="Helvetica"/>
-                <w:kern w:val="0"/>
-                <w:sz w:val="24"/>
-                <w:szCs w:val="24"/>
-                <w:lang w:val="en-US" w:eastAsia="en-US" w:bidi="ar-SA"/>
-              </w:rPr>
-              <w:t>total(times_per_year=12</w:t>
-            </w:r>
-            <w:r>
-              <w:rPr>
-                <w:rFonts w:eastAsia="Calibri" w:cs="Arial" w:ascii="Helvetica" w:hAnsi="Helvetica"/>
-                <w:kern w:val="0"/>
-                <w:sz w:val="24"/>
-                <w:szCs w:val="24"/>
-                <w:lang w:val="en-US" w:eastAsia="en-US" w:bidi="ar-SA"/>
-              </w:rPr>
-              <w:t>), show_decimals=True</w:t>
-            </w:r>
-            <w:r>
-              <w:rPr>
-                <w:rFonts w:eastAsia="Calibri" w:cs="Arial" w:ascii="Helvetica" w:hAnsi="Helvetica"/>
-                <w:kern w:val="0"/>
-                <w:sz w:val="24"/>
-                <w:szCs w:val="24"/>
-                <w:lang w:val="en-US" w:eastAsia="en-US" w:bidi="ar-SA"/>
-              </w:rPr>
-              <w:t>)</w:t>
-            </w:r>
-            <w:r>
-              <w:rPr>
-                <w:rFonts w:eastAsia="Calibri" w:cs="Arial" w:ascii="Helvetica" w:hAnsi="Helvetica"/>
-                <w:kern w:val="0"/>
-                <w:sz w:val="24"/>
-                <w:szCs w:val="24"/>
-                <w:lang w:val="en-US" w:eastAsia="en-US" w:bidi="ar-SA"/>
-              </w:rPr>
-              <w:t xml:space="preserve"> }} </w:t>
-            </w:r>
-            <w:r>
-              <w:rPr>
-                <w:rFonts w:eastAsia="Calibri" w:cs="Arial" w:ascii="Helvetica" w:hAnsi="Helvetica"/>
-                <w:kern w:val="0"/>
-                <w:sz w:val="24"/>
-                <w:szCs w:val="24"/>
-                <w:lang w:val="en-US" w:eastAsia="en-US" w:bidi="ar-SA"/>
-              </w:rPr>
-              <w:t>per month</w:t>
+            <w:tcW w:w="7754" w:type="dxa"/>
+            <w:tcBorders/>
+          </w:tcPr>
+          <w:p>
+            <w:pPr>
+              <w:pStyle w:val="Normal"/>
+              <w:widowControl w:val="false"/>
+              <w:suppressAutoHyphens w:val="true"/>
+              <w:spacing w:lineRule="auto" w:line="240" w:before="0" w:after="0"/>
+              <w:jc w:val="left"/>
+              <w:rPr>
+                <w:rFonts w:ascii="Helvetica" w:hAnsi="Helvetica"/>
+                <w:sz w:val="24"/>
+                <w:szCs w:val="24"/>
+              </w:rPr>
+            </w:pPr>
+            <w:r>
+              <w:rPr>
+                <w:rFonts w:eastAsia="Calibri" w:cs="Arial" w:ascii="Helvetica" w:hAnsi="Helvetica"/>
+                <w:kern w:val="0"/>
+                <w:sz w:val="24"/>
+                <w:szCs w:val="24"/>
+                <w:lang w:val="en-US" w:eastAsia="en-US" w:bidi="ar-SA"/>
+              </w:rPr>
+              <w:t>{{ row.</w:t>
+            </w:r>
+            <w:r>
+              <w:rPr>
+                <w:rFonts w:eastAsia="Calibri" w:cs="Arial" w:ascii="Helvetica" w:hAnsi="Helvetica"/>
+                <w:kern w:val="0"/>
+                <w:sz w:val="24"/>
+                <w:szCs w:val="24"/>
+                <w:lang w:val="en-US" w:eastAsia="en-US" w:bidi="ar-SA"/>
+              </w:rPr>
+              <w:t>description</w:t>
+            </w:r>
+            <w:r>
+              <w:rPr>
+                <w:rFonts w:eastAsia="Calibri" w:cs="Arial" w:ascii="Helvetica" w:hAnsi="Helvetica"/>
+                <w:kern w:val="0"/>
+                <w:sz w:val="24"/>
+                <w:szCs w:val="24"/>
+                <w:lang w:val="en-US" w:eastAsia="en-US" w:bidi="ar-SA"/>
+              </w:rPr>
+              <w:t xml:space="preserve"> }}</w:t>
+            </w:r>
+          </w:p>
+        </w:tc>
+        <w:tc>
+          <w:tcPr>
+            <w:tcW w:w="1605" w:type="dxa"/>
+            <w:tcBorders/>
+          </w:tcPr>
+          <w:p>
+            <w:pPr>
+              <w:pStyle w:val="Normal"/>
+              <w:widowControl w:val="false"/>
+              <w:suppressAutoHyphens w:val="true"/>
+              <w:spacing w:lineRule="auto" w:line="240" w:before="0" w:after="0"/>
+              <w:jc w:val="left"/>
+              <w:rPr>
+                <w:rFonts w:ascii="Helvetica" w:hAnsi="Helvetica"/>
+                <w:sz w:val="24"/>
+                <w:szCs w:val="24"/>
+              </w:rPr>
+            </w:pPr>
+            <w:r>
+              <w:rPr>
+                <w:rFonts w:eastAsia="Calibri" w:cs="Arial" w:ascii="Helvetica" w:hAnsi="Helvetica"/>
+                <w:kern w:val="0"/>
+                <w:sz w:val="24"/>
+                <w:szCs w:val="24"/>
+                <w:lang w:val="en-US" w:eastAsia="en-US" w:bidi="ar-SA"/>
+              </w:rPr>
+              <w:t>${{ thousands(row.total(times_per_year=12), show_decimals=True) }} per month</w:t>
             </w:r>
           </w:p>
         </w:tc>
@@ -4101,7 +3445,7 @@
         <w:trPr/>
         <w:tc>
           <w:tcPr>
-            <w:tcW w:w="6300" w:type="dxa"/>
+            <w:tcW w:w="7754" w:type="dxa"/>
             <w:tcBorders/>
           </w:tcPr>
           <w:p>
@@ -4131,7 +3475,7 @@
         </w:tc>
         <w:tc>
           <w:tcPr>
-            <w:tcW w:w="1304" w:type="dxa"/>
+            <w:tcW w:w="1605" w:type="dxa"/>
             <w:tcBorders/>
           </w:tcPr>
           <w:p>
@@ -4190,23 +3534,7 @@
           <w:sz w:val="24"/>
           <w:szCs w:val="24"/>
         </w:rPr>
-        <w:t>{%p elif field.field_name in [ "support_recipient.extraordinary_childre</w:t>
-      </w:r>
-      <w:r>
-        <w:rPr>
-          <w:rFonts w:ascii="Helvetica" w:hAnsi="Helvetica"/>
-          <w:sz w:val="24"/>
-          <w:szCs w:val="24"/>
-        </w:rPr>
-        <w:t>aring</w:t>
-      </w:r>
-      <w:r>
-        <w:rPr>
-          <w:rFonts w:ascii="Helvetica" w:hAnsi="Helvetica"/>
-          <w:sz w:val="24"/>
-          <w:szCs w:val="24"/>
-        </w:rPr>
-        <w:t>_costs_in_14"] %}</w:t>
+        <w:t>{%p elif field.field_name in [ "support_recipient.extraordinary_childrearing_costs_in_14"] %}</w:t>
       </w:r>
     </w:p>
     <w:p>
@@ -4228,39 +3556,7 @@
           <w:sz w:val="24"/>
           <w:szCs w:val="24"/>
         </w:rPr>
-        <w:t>13a</w:t>
-      </w:r>
-      <w:r>
-        <w:rPr>
-          <w:rFonts w:cs="Arial" w:ascii="Helvetica" w:hAnsi="Helvetica"/>
-          <w:sz w:val="24"/>
-          <w:szCs w:val="24"/>
-        </w:rPr>
-        <w:t xml:space="preserve">. </w:t>
-      </w:r>
-      <w:r>
-        <w:rPr>
-          <w:rFonts w:cs="Arial" w:ascii="Helvetica" w:hAnsi="Helvetica"/>
-          <w:sz w:val="24"/>
-          <w:szCs w:val="24"/>
-        </w:rPr>
-        <w:t>Extraordinary Childrearing Costs for {{ support_</w:t>
-      </w:r>
-      <w:r>
-        <w:rPr>
-          <w:rFonts w:cs="Arial" w:ascii="Helvetica" w:hAnsi="Helvetica"/>
-          <w:sz w:val="24"/>
-          <w:szCs w:val="24"/>
-        </w:rPr>
-        <w:t>recipient.</w:t>
-      </w:r>
-      <w:r>
-        <w:rPr>
-          <w:rFonts w:cs="Arial" w:ascii="Helvetica" w:hAnsi="Helvetica"/>
-          <w:sz w:val="24"/>
-          <w:szCs w:val="24"/>
-        </w:rPr>
-        <w:t>name_full() }} included in Form 14</w:t>
+        <w:t>13a. Extraordinary Childrearing Costs for {{ support_recipient.name_full() }} included in Form 14</w:t>
       </w:r>
     </w:p>
     <w:tbl>
@@ -4279,14 +3575,14 @@
         <w:tblLook w:val="04a0" w:noHBand="0" w:noVBand="1" w:firstColumn="1" w:lastRow="0" w:lastColumn="0" w:firstRow="1"/>
       </w:tblPr>
       <w:tblGrid>
-        <w:gridCol w:w="6300"/>
-        <w:gridCol w:w="1304"/>
+        <w:gridCol w:w="7754"/>
+        <w:gridCol w:w="1605"/>
       </w:tblGrid>
       <w:tr>
         <w:trPr/>
         <w:tc>
           <w:tcPr>
-            <w:tcW w:w="6300" w:type="dxa"/>
+            <w:tcW w:w="7754" w:type="dxa"/>
             <w:tcBorders/>
           </w:tcPr>
           <w:p>
@@ -4317,7 +3613,7 @@
         </w:tc>
         <w:tc>
           <w:tcPr>
-            <w:tcW w:w="1304" w:type="dxa"/>
+            <w:tcW w:w="1605" w:type="dxa"/>
             <w:tcBorders/>
           </w:tcPr>
           <w:p>
@@ -4351,7 +3647,7 @@
         <w:trPr/>
         <w:tc>
           <w:tcPr>
-            <w:tcW w:w="6300" w:type="dxa"/>
+            <w:tcW w:w="7754" w:type="dxa"/>
             <w:tcBorders/>
           </w:tcPr>
           <w:p>
@@ -4381,7 +3677,7 @@
         </w:tc>
         <w:tc>
           <w:tcPr>
-            <w:tcW w:w="1304" w:type="dxa"/>
+            <w:tcW w:w="1605" w:type="dxa"/>
             <w:tcBorders/>
           </w:tcPr>
           <w:p>
@@ -4411,141 +3707,81 @@
         <w:trPr/>
         <w:tc>
           <w:tcPr>
-            <w:tcW w:w="6300" w:type="dxa"/>
-            <w:tcBorders/>
-          </w:tcPr>
-          <w:p>
-            <w:pPr>
-              <w:pStyle w:val="Normal"/>
-              <w:widowControl w:val="false"/>
-              <w:suppressAutoHyphens w:val="true"/>
-              <w:spacing w:lineRule="auto" w:line="240" w:before="0" w:after="0"/>
-              <w:jc w:val="left"/>
-              <w:rPr>
-                <w:rFonts w:ascii="Helvetica" w:hAnsi="Helvetica"/>
-                <w:sz w:val="24"/>
-                <w:szCs w:val="24"/>
-              </w:rPr>
-            </w:pPr>
-            <w:r>
-              <w:rPr>
-                <w:rFonts w:eastAsia="Calibri" w:cs="Arial" w:ascii="Helvetica" w:hAnsi="Helvetica"/>
-                <w:kern w:val="0"/>
-                <w:sz w:val="24"/>
-                <w:szCs w:val="24"/>
-                <w:lang w:val="en-US" w:eastAsia="en-US" w:bidi="ar-SA"/>
-              </w:rPr>
-              <w:t>{{ row.name.full() }}</w:t>
-            </w:r>
-          </w:p>
-        </w:tc>
-        <w:tc>
-          <w:tcPr>
-            <w:tcW w:w="1304" w:type="dxa"/>
-            <w:tcBorders/>
-          </w:tcPr>
-          <w:p>
-            <w:pPr>
-              <w:pStyle w:val="Normal"/>
-              <w:widowControl w:val="false"/>
-              <w:suppressAutoHyphens w:val="true"/>
-              <w:spacing w:lineRule="auto" w:line="240" w:before="0" w:after="0"/>
-              <w:jc w:val="left"/>
-              <w:rPr>
-                <w:rFonts w:ascii="Helvetica" w:hAnsi="Helvetica"/>
-                <w:sz w:val="24"/>
-                <w:szCs w:val="24"/>
-              </w:rPr>
-            </w:pPr>
-            <w:r>
-              <w:rPr>
-                <w:rFonts w:eastAsia="Calibri" w:cs="Arial" w:ascii="Helvetica" w:hAnsi="Helvetica"/>
-                <w:kern w:val="0"/>
-                <w:sz w:val="24"/>
-                <w:szCs w:val="24"/>
-                <w:lang w:val="en-US" w:eastAsia="en-US" w:bidi="ar-SA"/>
-              </w:rPr>
-              <w:t>$</w:t>
-            </w:r>
-            <w:r>
-              <w:rPr>
-                <w:rFonts w:eastAsia="Calibri" w:cs="Arial" w:ascii="Helvetica" w:hAnsi="Helvetica"/>
-                <w:kern w:val="0"/>
-                <w:sz w:val="24"/>
-                <w:szCs w:val="24"/>
-                <w:lang w:val="en-US" w:eastAsia="en-US" w:bidi="ar-SA"/>
-              </w:rPr>
-              <w:t xml:space="preserve">{{ </w:t>
-            </w:r>
-            <w:r>
-              <w:rPr>
-                <w:rFonts w:eastAsia="Calibri" w:cs="Arial" w:ascii="Helvetica" w:hAnsi="Helvetica"/>
-                <w:kern w:val="0"/>
-                <w:sz w:val="24"/>
-                <w:szCs w:val="24"/>
-                <w:lang w:val="en-US" w:eastAsia="en-US" w:bidi="ar-SA"/>
-              </w:rPr>
-              <w:t>thousands(</w:t>
-            </w:r>
-            <w:r>
-              <w:rPr>
-                <w:rFonts w:eastAsia="Calibri" w:cs="Arial" w:ascii="Helvetica" w:hAnsi="Helvetica"/>
-                <w:kern w:val="0"/>
-                <w:sz w:val="24"/>
-                <w:szCs w:val="24"/>
-                <w:lang w:val="en-US" w:eastAsia="en-US" w:bidi="ar-SA"/>
-              </w:rPr>
-              <w:t>row.</w:t>
-            </w:r>
-            <w:r>
-              <w:rPr>
-                <w:rFonts w:eastAsia="Calibri" w:cs="Arial" w:ascii="Helvetica" w:hAnsi="Helvetica"/>
-                <w:kern w:val="0"/>
-                <w:sz w:val="24"/>
-                <w:szCs w:val="24"/>
-                <w:lang w:val="en-US" w:eastAsia="en-US" w:bidi="ar-SA"/>
-              </w:rPr>
-              <w:t>total(times_per_year=12</w:t>
-            </w:r>
-            <w:r>
-              <w:rPr>
-                <w:rFonts w:eastAsia="Calibri" w:cs="Arial" w:ascii="Helvetica" w:hAnsi="Helvetica"/>
-                <w:kern w:val="0"/>
-                <w:sz w:val="24"/>
-                <w:szCs w:val="24"/>
-                <w:lang w:val="en-US" w:eastAsia="en-US" w:bidi="ar-SA"/>
-              </w:rPr>
-              <w:t>), show_decimals=True</w:t>
-            </w:r>
-            <w:r>
-              <w:rPr>
-                <w:rFonts w:eastAsia="Calibri" w:cs="Arial" w:ascii="Helvetica" w:hAnsi="Helvetica"/>
-                <w:kern w:val="0"/>
-                <w:sz w:val="24"/>
-                <w:szCs w:val="24"/>
-                <w:lang w:val="en-US" w:eastAsia="en-US" w:bidi="ar-SA"/>
-              </w:rPr>
-              <w:t>)</w:t>
-            </w:r>
-            <w:r>
-              <w:rPr>
-                <w:rFonts w:eastAsia="Calibri" w:cs="Arial" w:ascii="Helvetica" w:hAnsi="Helvetica"/>
-                <w:kern w:val="0"/>
-                <w:sz w:val="24"/>
-                <w:szCs w:val="24"/>
-                <w:lang w:val="en-US" w:eastAsia="en-US" w:bidi="ar-SA"/>
-              </w:rPr>
-              <w:t xml:space="preserve"> }} </w:t>
-            </w:r>
-            <w:r>
-              <w:rPr>
-                <w:rFonts w:eastAsia="Calibri" w:cs="Arial" w:ascii="Helvetica" w:hAnsi="Helvetica"/>
-                <w:kern w:val="0"/>
-                <w:sz w:val="24"/>
-                <w:szCs w:val="24"/>
-                <w:lang w:val="en-US" w:eastAsia="en-US" w:bidi="ar-SA"/>
-              </w:rPr>
-              <w:t>per month</w:t>
+            <w:tcW w:w="7754" w:type="dxa"/>
+            <w:tcBorders/>
+          </w:tcPr>
+          <w:p>
+            <w:pPr>
+              <w:pStyle w:val="Normal"/>
+              <w:widowControl w:val="false"/>
+              <w:suppressAutoHyphens w:val="true"/>
+              <w:spacing w:lineRule="auto" w:line="240" w:before="0" w:after="0"/>
+              <w:jc w:val="left"/>
+              <w:rPr>
+                <w:rFonts w:ascii="Helvetica" w:hAnsi="Helvetica"/>
+                <w:sz w:val="24"/>
+                <w:szCs w:val="24"/>
+              </w:rPr>
+            </w:pPr>
+            <w:r>
+              <w:rPr>
+                <w:rFonts w:eastAsia="Calibri" w:cs="Arial" w:ascii="Helvetica" w:hAnsi="Helvetica"/>
+                <w:kern w:val="0"/>
+                <w:sz w:val="24"/>
+                <w:szCs w:val="24"/>
+                <w:lang w:val="en-US" w:eastAsia="en-US" w:bidi="ar-SA"/>
+              </w:rPr>
+              <w:t>{{ row.</w:t>
+            </w:r>
+            <w:r>
+              <w:rPr>
+                <w:rFonts w:eastAsia="Calibri" w:cs="Arial" w:ascii="Helvetica" w:hAnsi="Helvetica"/>
+                <w:kern w:val="0"/>
+                <w:sz w:val="24"/>
+                <w:szCs w:val="24"/>
+                <w:lang w:val="en-US" w:eastAsia="en-US" w:bidi="ar-SA"/>
+              </w:rPr>
+              <w:t xml:space="preserve">description </w:t>
+            </w:r>
+            <w:r>
+              <w:rPr>
+                <w:rFonts w:eastAsia="Calibri" w:cs="Arial" w:ascii="Helvetica" w:hAnsi="Helvetica"/>
+                <w:kern w:val="0"/>
+                <w:sz w:val="24"/>
+                <w:szCs w:val="24"/>
+                <w:lang w:val="en-US" w:eastAsia="en-US" w:bidi="ar-SA"/>
+              </w:rPr>
+              <w:t>}}</w:t>
+            </w:r>
+          </w:p>
+        </w:tc>
+        <w:tc>
+          <w:tcPr>
+            <w:tcW w:w="1605" w:type="dxa"/>
+            <w:tcBorders/>
+          </w:tcPr>
+          <w:p>
+            <w:pPr>
+              <w:pStyle w:val="Normal"/>
+              <w:widowControl w:val="false"/>
+              <w:suppressAutoHyphens w:val="true"/>
+              <w:spacing w:lineRule="auto" w:line="240" w:before="0" w:after="0"/>
+              <w:jc w:val="left"/>
+              <w:rPr>
+                <w:rFonts w:ascii="Helvetica" w:hAnsi="Helvetica"/>
+                <w:sz w:val="24"/>
+                <w:szCs w:val="24"/>
+              </w:rPr>
+            </w:pPr>
+            <w:r>
+              <w:rPr>
+                <w:rFonts w:eastAsia="Calibri" w:cs="Arial" w:ascii="Helvetica" w:hAnsi="Helvetica"/>
+                <w:kern w:val="0"/>
+                <w:sz w:val="24"/>
+                <w:szCs w:val="24"/>
+                <w:lang w:val="en-US" w:eastAsia="en-US" w:bidi="ar-SA"/>
+              </w:rPr>
+              <w:t>${{ thousands(row.total(times_per_year=12), show_decimals=True) }} per month</w:t>
             </w:r>
           </w:p>
         </w:tc>
@@ -4554,7 +3790,7 @@
         <w:trPr/>
         <w:tc>
           <w:tcPr>
-            <w:tcW w:w="6300" w:type="dxa"/>
+            <w:tcW w:w="7754" w:type="dxa"/>
             <w:tcBorders/>
           </w:tcPr>
           <w:p>
@@ -4584,7 +3820,7 @@
         </w:tc>
         <w:tc>
           <w:tcPr>
-            <w:tcW w:w="1304" w:type="dxa"/>
+            <w:tcW w:w="1605" w:type="dxa"/>
             <w:tcBorders/>
           </w:tcPr>
           <w:p>
@@ -4643,55 +3879,7 @@
           <w:sz w:val="24"/>
           <w:szCs w:val="24"/>
         </w:rPr>
-        <w:t>{%p elif field.field_name in ["support_payer.extraordinary_child</w:t>
-      </w:r>
-      <w:r>
-        <w:rPr>
-          <w:rFonts w:ascii="Helvetica" w:hAnsi="Helvetica"/>
-          <w:sz w:val="24"/>
-          <w:szCs w:val="24"/>
-        </w:rPr>
-        <w:t>rearing</w:t>
-      </w:r>
-      <w:r>
-        <w:rPr>
-          <w:rFonts w:ascii="Helvetica" w:hAnsi="Helvetica"/>
-          <w:sz w:val="24"/>
-          <w:szCs w:val="24"/>
-        </w:rPr>
-        <w:t>_costs_</w:t>
-      </w:r>
-      <w:r>
-        <w:rPr>
-          <w:rFonts w:ascii="Helvetica" w:hAnsi="Helvetica"/>
-          <w:sz w:val="24"/>
-          <w:szCs w:val="24"/>
-        </w:rPr>
-        <w:t>not_</w:t>
-      </w:r>
-      <w:r>
-        <w:rPr>
-          <w:rFonts w:ascii="Helvetica" w:hAnsi="Helvetica"/>
-          <w:sz w:val="24"/>
-          <w:szCs w:val="24"/>
-        </w:rPr>
-        <w:t>in_14"</w:t>
-      </w:r>
-      <w:r>
-        <w:rPr>
-          <w:rFonts w:ascii="Helvetica" w:hAnsi="Helvetica"/>
-          <w:sz w:val="24"/>
-          <w:szCs w:val="24"/>
-        </w:rPr>
-        <w:t>]</w:t>
-      </w:r>
-      <w:r>
-        <w:rPr>
-          <w:rFonts w:ascii="Helvetica" w:hAnsi="Helvetica"/>
-          <w:sz w:val="24"/>
-          <w:szCs w:val="24"/>
-        </w:rPr>
-        <w:t xml:space="preserve"> %}</w:t>
+        <w:t>{%p elif field.field_name in ["support_payer.extraordinary_childrearing_costs_not_in_14"] %}</w:t>
       </w:r>
     </w:p>
     <w:p>
@@ -4713,39 +3901,7 @@
           <w:sz w:val="24"/>
           <w:szCs w:val="24"/>
         </w:rPr>
-        <w:t>13b</w:t>
-      </w:r>
-      <w:r>
-        <w:rPr>
-          <w:rFonts w:cs="Arial" w:ascii="Helvetica" w:hAnsi="Helvetica"/>
-          <w:sz w:val="24"/>
-          <w:szCs w:val="24"/>
-        </w:rPr>
-        <w:t xml:space="preserve">. </w:t>
-      </w:r>
-      <w:r>
-        <w:rPr>
-          <w:rFonts w:cs="Arial" w:ascii="Helvetica" w:hAnsi="Helvetica"/>
-          <w:sz w:val="24"/>
-          <w:szCs w:val="24"/>
-        </w:rPr>
-        <w:t xml:space="preserve">Extraordinary Childrearing Costs for {{ support_payer.name_full() }} </w:t>
-      </w:r>
-      <w:r>
-        <w:rPr>
-          <w:rFonts w:cs="Arial" w:ascii="Helvetica" w:hAnsi="Helvetica"/>
-          <w:sz w:val="24"/>
-          <w:szCs w:val="24"/>
-        </w:rPr>
-        <w:t xml:space="preserve">not </w:t>
-      </w:r>
-      <w:r>
-        <w:rPr>
-          <w:rFonts w:cs="Arial" w:ascii="Helvetica" w:hAnsi="Helvetica"/>
-          <w:sz w:val="24"/>
-          <w:szCs w:val="24"/>
-        </w:rPr>
-        <w:t>included in Form 14</w:t>
+        <w:t>13b. Extraordinary Childrearing Costs for {{ support_payer.name_full() }} not included in Form 14</w:t>
       </w:r>
     </w:p>
     <w:tbl>
@@ -4764,14 +3920,14 @@
         <w:tblLook w:val="04a0" w:noHBand="0" w:noVBand="1" w:firstColumn="1" w:lastRow="0" w:lastColumn="0" w:firstRow="1"/>
       </w:tblPr>
       <w:tblGrid>
-        <w:gridCol w:w="6300"/>
-        <w:gridCol w:w="1304"/>
+        <w:gridCol w:w="7754"/>
+        <w:gridCol w:w="1605"/>
       </w:tblGrid>
       <w:tr>
         <w:trPr/>
         <w:tc>
           <w:tcPr>
-            <w:tcW w:w="6300" w:type="dxa"/>
+            <w:tcW w:w="7754" w:type="dxa"/>
             <w:tcBorders/>
           </w:tcPr>
           <w:p>
@@ -4802,7 +3958,7 @@
         </w:tc>
         <w:tc>
           <w:tcPr>
-            <w:tcW w:w="1304" w:type="dxa"/>
+            <w:tcW w:w="1605" w:type="dxa"/>
             <w:tcBorders/>
           </w:tcPr>
           <w:p>
@@ -4836,7 +3992,7 @@
         <w:trPr/>
         <w:tc>
           <w:tcPr>
-            <w:tcW w:w="6300" w:type="dxa"/>
+            <w:tcW w:w="7754" w:type="dxa"/>
             <w:tcBorders/>
           </w:tcPr>
           <w:p>
@@ -4866,7 +4022,7 @@
         </w:tc>
         <w:tc>
           <w:tcPr>
-            <w:tcW w:w="1304" w:type="dxa"/>
+            <w:tcW w:w="1605" w:type="dxa"/>
             <w:tcBorders/>
           </w:tcPr>
           <w:p>
@@ -4896,121 +4052,81 @@
         <w:trPr/>
         <w:tc>
           <w:tcPr>
-            <w:tcW w:w="6300" w:type="dxa"/>
-            <w:tcBorders/>
-          </w:tcPr>
-          <w:p>
-            <w:pPr>
-              <w:pStyle w:val="Normal"/>
-              <w:widowControl w:val="false"/>
-              <w:suppressAutoHyphens w:val="true"/>
-              <w:spacing w:lineRule="auto" w:line="240" w:before="0" w:after="0"/>
-              <w:jc w:val="left"/>
-              <w:rPr>
-                <w:rFonts w:ascii="Helvetica" w:hAnsi="Helvetica"/>
-                <w:sz w:val="24"/>
-                <w:szCs w:val="24"/>
-              </w:rPr>
-            </w:pPr>
-            <w:r>
-              <w:rPr>
-                <w:rFonts w:eastAsia="Calibri" w:cs="Arial" w:ascii="Helvetica" w:hAnsi="Helvetica"/>
-                <w:kern w:val="0"/>
-                <w:sz w:val="24"/>
-                <w:szCs w:val="24"/>
-                <w:lang w:val="en-US" w:eastAsia="en-US" w:bidi="ar-SA"/>
-              </w:rPr>
-              <w:t>{{ row.name.full() }}</w:t>
-            </w:r>
-          </w:p>
-        </w:tc>
-        <w:tc>
-          <w:tcPr>
-            <w:tcW w:w="1304" w:type="dxa"/>
-            <w:tcBorders/>
-          </w:tcPr>
-          <w:p>
-            <w:pPr>
-              <w:pStyle w:val="Normal"/>
-              <w:widowControl w:val="false"/>
-              <w:suppressAutoHyphens w:val="true"/>
-              <w:spacing w:lineRule="auto" w:line="240" w:before="0" w:after="0"/>
-              <w:jc w:val="left"/>
-              <w:rPr>
-                <w:rFonts w:ascii="Helvetica" w:hAnsi="Helvetica"/>
-                <w:sz w:val="24"/>
-                <w:szCs w:val="24"/>
-              </w:rPr>
-            </w:pPr>
-            <w:r>
-              <w:rPr>
-                <w:rFonts w:eastAsia="Calibri" w:cs="Arial" w:ascii="Helvetica" w:hAnsi="Helvetica"/>
-                <w:kern w:val="0"/>
-                <w:sz w:val="24"/>
-                <w:szCs w:val="24"/>
-                <w:lang w:val="en-US" w:eastAsia="en-US" w:bidi="ar-SA"/>
-              </w:rPr>
-              <w:t>{</w:t>
-            </w:r>
-            <w:r>
-              <w:rPr>
-                <w:rFonts w:eastAsia="Calibri" w:cs="Arial" w:ascii="Helvetica" w:hAnsi="Helvetica"/>
-                <w:kern w:val="0"/>
-                <w:sz w:val="24"/>
-                <w:szCs w:val="24"/>
-                <w:lang w:val="en-US" w:eastAsia="en-US" w:bidi="ar-SA"/>
-              </w:rPr>
-              <w:t xml:space="preserve">{ </w:t>
-            </w:r>
-            <w:r>
-              <w:rPr>
-                <w:rFonts w:eastAsia="Calibri" w:cs="Arial" w:ascii="Helvetica" w:hAnsi="Helvetica"/>
-                <w:kern w:val="0"/>
-                <w:sz w:val="24"/>
-                <w:szCs w:val="24"/>
-                <w:lang w:val="en-US" w:eastAsia="en-US" w:bidi="ar-SA"/>
-              </w:rPr>
-              <w:t>"{:.0f}".format(</w:t>
-            </w:r>
-            <w:r>
-              <w:rPr>
-                <w:rFonts w:eastAsia="Calibri" w:cs="Arial" w:ascii="Helvetica" w:hAnsi="Helvetica"/>
-                <w:kern w:val="0"/>
-                <w:sz w:val="24"/>
-                <w:szCs w:val="24"/>
-                <w:lang w:val="en-US" w:eastAsia="en-US" w:bidi="ar-SA"/>
-              </w:rPr>
-              <w:t>row</w:t>
-            </w:r>
-            <w:r>
-              <w:rPr>
-                <w:rFonts w:eastAsia="Calibri" w:cs="Arial" w:ascii="Helvetica" w:hAnsi="Helvetica"/>
-                <w:kern w:val="0"/>
-                <w:sz w:val="24"/>
-                <w:szCs w:val="24"/>
-                <w:lang w:val="en-US" w:eastAsia="en-US" w:bidi="ar-SA"/>
-              </w:rPr>
-              <w:t>.percentage)</w:t>
-            </w:r>
-            <w:r>
-              <w:rPr>
-                <w:rFonts w:eastAsia="Calibri" w:cs="Arial" w:ascii="Helvetica" w:hAnsi="Helvetica"/>
-                <w:kern w:val="0"/>
-                <w:sz w:val="24"/>
-                <w:szCs w:val="24"/>
-                <w:lang w:val="en-US" w:eastAsia="en-US" w:bidi="ar-SA"/>
-              </w:rPr>
-              <w:t xml:space="preserve"> }} </w:t>
-            </w:r>
-            <w:r>
-              <w:rPr>
-                <w:rFonts w:eastAsia="Calibri" w:cs="Arial" w:ascii="Helvetica" w:hAnsi="Helvetica"/>
-                <w:kern w:val="0"/>
-                <w:sz w:val="24"/>
-                <w:szCs w:val="24"/>
-                <w:lang w:val="en-US" w:eastAsia="en-US" w:bidi="ar-SA"/>
-              </w:rPr>
-              <w:t>%</w:t>
+            <w:tcW w:w="7754" w:type="dxa"/>
+            <w:tcBorders/>
+          </w:tcPr>
+          <w:p>
+            <w:pPr>
+              <w:pStyle w:val="Normal"/>
+              <w:widowControl w:val="false"/>
+              <w:suppressAutoHyphens w:val="true"/>
+              <w:spacing w:lineRule="auto" w:line="240" w:before="0" w:after="0"/>
+              <w:jc w:val="left"/>
+              <w:rPr>
+                <w:rFonts w:ascii="Helvetica" w:hAnsi="Helvetica"/>
+                <w:sz w:val="24"/>
+                <w:szCs w:val="24"/>
+              </w:rPr>
+            </w:pPr>
+            <w:r>
+              <w:rPr>
+                <w:rFonts w:eastAsia="Calibri" w:cs="Arial" w:ascii="Helvetica" w:hAnsi="Helvetica"/>
+                <w:kern w:val="0"/>
+                <w:sz w:val="24"/>
+                <w:szCs w:val="24"/>
+                <w:lang w:val="en-US" w:eastAsia="en-US" w:bidi="ar-SA"/>
+              </w:rPr>
+              <w:t>{{ row.</w:t>
+            </w:r>
+            <w:r>
+              <w:rPr>
+                <w:rFonts w:eastAsia="Calibri" w:cs="Arial" w:ascii="Helvetica" w:hAnsi="Helvetica"/>
+                <w:kern w:val="0"/>
+                <w:sz w:val="24"/>
+                <w:szCs w:val="24"/>
+                <w:lang w:val="en-US" w:eastAsia="en-US" w:bidi="ar-SA"/>
+              </w:rPr>
+              <w:t>description</w:t>
+            </w:r>
+            <w:r>
+              <w:rPr>
+                <w:rFonts w:eastAsia="Calibri" w:cs="Arial" w:ascii="Helvetica" w:hAnsi="Helvetica"/>
+                <w:kern w:val="0"/>
+                <w:sz w:val="24"/>
+                <w:szCs w:val="24"/>
+                <w:lang w:val="en-US" w:eastAsia="en-US" w:bidi="ar-SA"/>
+              </w:rPr>
+              <w:t xml:space="preserve"> }}</w:t>
+            </w:r>
+          </w:p>
+        </w:tc>
+        <w:tc>
+          <w:tcPr>
+            <w:tcW w:w="1605" w:type="dxa"/>
+            <w:tcBorders/>
+          </w:tcPr>
+          <w:p>
+            <w:pPr>
+              <w:pStyle w:val="Normal"/>
+              <w:widowControl w:val="false"/>
+              <w:suppressAutoHyphens w:val="true"/>
+              <w:spacing w:lineRule="auto" w:line="240" w:before="0" w:after="0"/>
+              <w:jc w:val="left"/>
+              <w:rPr>
+                <w:rFonts w:ascii="Helvetica" w:hAnsi="Helvetica"/>
+                <w:sz w:val="24"/>
+                <w:szCs w:val="24"/>
+              </w:rPr>
+            </w:pPr>
+            <w:r>
+              <w:rPr>
+                <w:rFonts w:eastAsia="Calibri" w:cs="Arial" w:ascii="Helvetica" w:hAnsi="Helvetica"/>
+                <w:kern w:val="0"/>
+                <w:sz w:val="24"/>
+                <w:szCs w:val="24"/>
+                <w:lang w:val="en-US" w:eastAsia="en-US" w:bidi="ar-SA"/>
+              </w:rPr>
+              <w:t>{{ "{:.0f}".format(row.percentage) }} %</w:t>
             </w:r>
           </w:p>
         </w:tc>
@@ -5019,7 +4135,7 @@
         <w:trPr/>
         <w:tc>
           <w:tcPr>
-            <w:tcW w:w="6300" w:type="dxa"/>
+            <w:tcW w:w="7754" w:type="dxa"/>
             <w:tcBorders/>
           </w:tcPr>
           <w:p>
@@ -5049,7 +4165,7 @@
         </w:tc>
         <w:tc>
           <w:tcPr>
-            <w:tcW w:w="1304" w:type="dxa"/>
+            <w:tcW w:w="1605" w:type="dxa"/>
             <w:tcBorders/>
           </w:tcPr>
           <w:p>
@@ -5108,39 +4224,7 @@
           <w:sz w:val="24"/>
           <w:szCs w:val="24"/>
         </w:rPr>
-        <w:t>{%p elif field.field_name in [ "support_recipient.extraordinary_childre</w:t>
-      </w:r>
-      <w:r>
-        <w:rPr>
-          <w:rFonts w:ascii="Helvetica" w:hAnsi="Helvetica"/>
-          <w:sz w:val="24"/>
-          <w:szCs w:val="24"/>
-        </w:rPr>
-        <w:t>aring</w:t>
-      </w:r>
-      <w:r>
-        <w:rPr>
-          <w:rFonts w:ascii="Helvetica" w:hAnsi="Helvetica"/>
-          <w:sz w:val="24"/>
-          <w:szCs w:val="24"/>
-        </w:rPr>
-        <w:t>_costs_</w:t>
-      </w:r>
-      <w:r>
-        <w:rPr>
-          <w:rFonts w:ascii="Helvetica" w:hAnsi="Helvetica"/>
-          <w:sz w:val="24"/>
-          <w:szCs w:val="24"/>
-        </w:rPr>
-        <w:t>not_</w:t>
-      </w:r>
-      <w:r>
-        <w:rPr>
-          <w:rFonts w:ascii="Helvetica" w:hAnsi="Helvetica"/>
-          <w:sz w:val="24"/>
-          <w:szCs w:val="24"/>
-        </w:rPr>
-        <w:t>in_14"] %}</w:t>
+        <w:t>{%p elif field.field_name in [ "support_recipient.extraordinary_childrearing_costs_not_in_14"] %}</w:t>
       </w:r>
     </w:p>
     <w:p>
@@ -5162,55 +4246,7 @@
           <w:sz w:val="24"/>
           <w:szCs w:val="24"/>
         </w:rPr>
-        <w:t>13b</w:t>
-      </w:r>
-      <w:r>
-        <w:rPr>
-          <w:rFonts w:cs="Arial" w:ascii="Helvetica" w:hAnsi="Helvetica"/>
-          <w:sz w:val="24"/>
-          <w:szCs w:val="24"/>
-        </w:rPr>
-        <w:t xml:space="preserve">. </w:t>
-      </w:r>
-      <w:r>
-        <w:rPr>
-          <w:rFonts w:cs="Arial" w:ascii="Helvetica" w:hAnsi="Helvetica"/>
-          <w:sz w:val="24"/>
-          <w:szCs w:val="24"/>
-        </w:rPr>
-        <w:t>Extraordinary Childrearing Costs for {{ support_</w:t>
-      </w:r>
-      <w:r>
-        <w:rPr>
-          <w:rFonts w:cs="Arial" w:ascii="Helvetica" w:hAnsi="Helvetica"/>
-          <w:sz w:val="24"/>
-          <w:szCs w:val="24"/>
-        </w:rPr>
-        <w:t>recipient.</w:t>
-      </w:r>
-      <w:r>
-        <w:rPr>
-          <w:rFonts w:cs="Arial" w:ascii="Helvetica" w:hAnsi="Helvetica"/>
-          <w:sz w:val="24"/>
-          <w:szCs w:val="24"/>
-        </w:rPr>
-        <w:t xml:space="preserve">name_full() }} </w:t>
-      </w:r>
-      <w:r>
-        <w:rPr>
-          <w:rFonts w:cs="Arial" w:ascii="Helvetica" w:hAnsi="Helvetica"/>
-          <w:sz w:val="24"/>
-          <w:szCs w:val="24"/>
-        </w:rPr>
-        <w:t xml:space="preserve">not </w:t>
-      </w:r>
-      <w:r>
-        <w:rPr>
-          <w:rFonts w:cs="Arial" w:ascii="Helvetica" w:hAnsi="Helvetica"/>
-          <w:sz w:val="24"/>
-          <w:szCs w:val="24"/>
-        </w:rPr>
-        <w:t>included in Form 14</w:t>
+        <w:t>13b. Extraordinary Childrearing Costs for {{ support_recipient.name_full() }} not included in Form 14</w:t>
       </w:r>
     </w:p>
     <w:tbl>
@@ -5229,14 +4265,14 @@
         <w:tblLook w:val="04a0" w:noHBand="0" w:noVBand="1" w:firstColumn="1" w:lastRow="0" w:lastColumn="0" w:firstRow="1"/>
       </w:tblPr>
       <w:tblGrid>
-        <w:gridCol w:w="6300"/>
-        <w:gridCol w:w="1304"/>
+        <w:gridCol w:w="7754"/>
+        <w:gridCol w:w="1605"/>
       </w:tblGrid>
       <w:tr>
         <w:trPr/>
         <w:tc>
           <w:tcPr>
-            <w:tcW w:w="6300" w:type="dxa"/>
+            <w:tcW w:w="7754" w:type="dxa"/>
             <w:tcBorders/>
           </w:tcPr>
           <w:p>
@@ -5267,7 +4303,7 @@
         </w:tc>
         <w:tc>
           <w:tcPr>
-            <w:tcW w:w="1304" w:type="dxa"/>
+            <w:tcW w:w="1605" w:type="dxa"/>
             <w:tcBorders/>
           </w:tcPr>
           <w:p>
@@ -5301,7 +4337,7 @@
         <w:trPr/>
         <w:tc>
           <w:tcPr>
-            <w:tcW w:w="6300" w:type="dxa"/>
+            <w:tcW w:w="7754" w:type="dxa"/>
             <w:tcBorders/>
           </w:tcPr>
           <w:p>
@@ -5331,7 +4367,7 @@
         </w:tc>
         <w:tc>
           <w:tcPr>
-            <w:tcW w:w="1304" w:type="dxa"/>
+            <w:tcW w:w="1605" w:type="dxa"/>
             <w:tcBorders/>
           </w:tcPr>
           <w:p>
@@ -5361,121 +4397,81 @@
         <w:trPr/>
         <w:tc>
           <w:tcPr>
-            <w:tcW w:w="6300" w:type="dxa"/>
-            <w:tcBorders/>
-          </w:tcPr>
-          <w:p>
-            <w:pPr>
-              <w:pStyle w:val="Normal"/>
-              <w:widowControl w:val="false"/>
-              <w:suppressAutoHyphens w:val="true"/>
-              <w:spacing w:lineRule="auto" w:line="240" w:before="0" w:after="0"/>
-              <w:jc w:val="left"/>
-              <w:rPr>
-                <w:rFonts w:ascii="Helvetica" w:hAnsi="Helvetica"/>
-                <w:sz w:val="24"/>
-                <w:szCs w:val="24"/>
-              </w:rPr>
-            </w:pPr>
-            <w:r>
-              <w:rPr>
-                <w:rFonts w:eastAsia="Calibri" w:cs="Arial" w:ascii="Helvetica" w:hAnsi="Helvetica"/>
-                <w:kern w:val="0"/>
-                <w:sz w:val="24"/>
-                <w:szCs w:val="24"/>
-                <w:lang w:val="en-US" w:eastAsia="en-US" w:bidi="ar-SA"/>
-              </w:rPr>
-              <w:t>{{ row.name.full() }}</w:t>
-            </w:r>
-          </w:p>
-        </w:tc>
-        <w:tc>
-          <w:tcPr>
-            <w:tcW w:w="1304" w:type="dxa"/>
-            <w:tcBorders/>
-          </w:tcPr>
-          <w:p>
-            <w:pPr>
-              <w:pStyle w:val="Normal"/>
-              <w:widowControl w:val="false"/>
-              <w:suppressAutoHyphens w:val="true"/>
-              <w:spacing w:lineRule="auto" w:line="240" w:before="0" w:after="0"/>
-              <w:jc w:val="left"/>
-              <w:rPr>
-                <w:rFonts w:ascii="Helvetica" w:hAnsi="Helvetica"/>
-                <w:sz w:val="24"/>
-                <w:szCs w:val="24"/>
-              </w:rPr>
-            </w:pPr>
-            <w:r>
-              <w:rPr>
-                <w:rFonts w:eastAsia="Calibri" w:cs="Arial" w:ascii="Helvetica" w:hAnsi="Helvetica"/>
-                <w:kern w:val="0"/>
-                <w:sz w:val="24"/>
-                <w:szCs w:val="24"/>
-                <w:lang w:val="en-US" w:eastAsia="en-US" w:bidi="ar-SA"/>
-              </w:rPr>
-              <w:t>{</w:t>
-            </w:r>
-            <w:r>
-              <w:rPr>
-                <w:rFonts w:eastAsia="Calibri" w:cs="Arial" w:ascii="Helvetica" w:hAnsi="Helvetica"/>
-                <w:kern w:val="0"/>
-                <w:sz w:val="24"/>
-                <w:szCs w:val="24"/>
-                <w:lang w:val="en-US" w:eastAsia="en-US" w:bidi="ar-SA"/>
-              </w:rPr>
-              <w:t xml:space="preserve">{ </w:t>
-            </w:r>
-            <w:r>
-              <w:rPr>
-                <w:rFonts w:eastAsia="Calibri" w:cs="Arial" w:ascii="Helvetica" w:hAnsi="Helvetica"/>
-                <w:kern w:val="0"/>
-                <w:sz w:val="24"/>
-                <w:szCs w:val="24"/>
-                <w:lang w:val="en-US" w:eastAsia="en-US" w:bidi="ar-SA"/>
-              </w:rPr>
-              <w:t>"{:.0f}".format(</w:t>
-            </w:r>
-            <w:r>
-              <w:rPr>
-                <w:rFonts w:eastAsia="Calibri" w:cs="Arial" w:ascii="Helvetica" w:hAnsi="Helvetica"/>
-                <w:kern w:val="0"/>
-                <w:sz w:val="24"/>
-                <w:szCs w:val="24"/>
-                <w:lang w:val="en-US" w:eastAsia="en-US" w:bidi="ar-SA"/>
-              </w:rPr>
-              <w:t>row</w:t>
-            </w:r>
-            <w:r>
-              <w:rPr>
-                <w:rFonts w:eastAsia="Calibri" w:cs="Arial" w:ascii="Helvetica" w:hAnsi="Helvetica"/>
-                <w:kern w:val="0"/>
-                <w:sz w:val="24"/>
-                <w:szCs w:val="24"/>
-                <w:lang w:val="en-US" w:eastAsia="en-US" w:bidi="ar-SA"/>
-              </w:rPr>
-              <w:t>.percentage)</w:t>
-            </w:r>
-            <w:r>
-              <w:rPr>
-                <w:rFonts w:eastAsia="Calibri" w:cs="Arial" w:ascii="Helvetica" w:hAnsi="Helvetica"/>
-                <w:kern w:val="0"/>
-                <w:sz w:val="24"/>
-                <w:szCs w:val="24"/>
-                <w:lang w:val="en-US" w:eastAsia="en-US" w:bidi="ar-SA"/>
-              </w:rPr>
-              <w:t xml:space="preserve"> }} </w:t>
-            </w:r>
-            <w:r>
-              <w:rPr>
-                <w:rFonts w:eastAsia="Calibri" w:cs="Arial" w:ascii="Helvetica" w:hAnsi="Helvetica"/>
-                <w:kern w:val="0"/>
-                <w:sz w:val="24"/>
-                <w:szCs w:val="24"/>
-                <w:lang w:val="en-US" w:eastAsia="en-US" w:bidi="ar-SA"/>
-              </w:rPr>
-              <w:t>%</w:t>
+            <w:tcW w:w="7754" w:type="dxa"/>
+            <w:tcBorders/>
+          </w:tcPr>
+          <w:p>
+            <w:pPr>
+              <w:pStyle w:val="Normal"/>
+              <w:widowControl w:val="false"/>
+              <w:suppressAutoHyphens w:val="true"/>
+              <w:spacing w:lineRule="auto" w:line="240" w:before="0" w:after="0"/>
+              <w:jc w:val="left"/>
+              <w:rPr>
+                <w:rFonts w:ascii="Helvetica" w:hAnsi="Helvetica"/>
+                <w:sz w:val="24"/>
+                <w:szCs w:val="24"/>
+              </w:rPr>
+            </w:pPr>
+            <w:r>
+              <w:rPr>
+                <w:rFonts w:eastAsia="Calibri" w:cs="Arial" w:ascii="Helvetica" w:hAnsi="Helvetica"/>
+                <w:kern w:val="0"/>
+                <w:sz w:val="24"/>
+                <w:szCs w:val="24"/>
+                <w:lang w:val="en-US" w:eastAsia="en-US" w:bidi="ar-SA"/>
+              </w:rPr>
+              <w:t>{{ row.</w:t>
+            </w:r>
+            <w:r>
+              <w:rPr>
+                <w:rFonts w:eastAsia="Calibri" w:cs="Arial" w:ascii="Helvetica" w:hAnsi="Helvetica"/>
+                <w:kern w:val="0"/>
+                <w:sz w:val="24"/>
+                <w:szCs w:val="24"/>
+                <w:lang w:val="en-US" w:eastAsia="en-US" w:bidi="ar-SA"/>
+              </w:rPr>
+              <w:t>description</w:t>
+            </w:r>
+            <w:r>
+              <w:rPr>
+                <w:rFonts w:eastAsia="Calibri" w:cs="Arial" w:ascii="Helvetica" w:hAnsi="Helvetica"/>
+                <w:kern w:val="0"/>
+                <w:sz w:val="24"/>
+                <w:szCs w:val="24"/>
+                <w:lang w:val="en-US" w:eastAsia="en-US" w:bidi="ar-SA"/>
+              </w:rPr>
+              <w:t xml:space="preserve"> }}</w:t>
+            </w:r>
+          </w:p>
+        </w:tc>
+        <w:tc>
+          <w:tcPr>
+            <w:tcW w:w="1605" w:type="dxa"/>
+            <w:tcBorders/>
+          </w:tcPr>
+          <w:p>
+            <w:pPr>
+              <w:pStyle w:val="Normal"/>
+              <w:widowControl w:val="false"/>
+              <w:suppressAutoHyphens w:val="true"/>
+              <w:spacing w:lineRule="auto" w:line="240" w:before="0" w:after="0"/>
+              <w:jc w:val="left"/>
+              <w:rPr>
+                <w:rFonts w:ascii="Helvetica" w:hAnsi="Helvetica"/>
+                <w:sz w:val="24"/>
+                <w:szCs w:val="24"/>
+              </w:rPr>
+            </w:pPr>
+            <w:r>
+              <w:rPr>
+                <w:rFonts w:eastAsia="Calibri" w:cs="Arial" w:ascii="Helvetica" w:hAnsi="Helvetica"/>
+                <w:kern w:val="0"/>
+                <w:sz w:val="24"/>
+                <w:szCs w:val="24"/>
+                <w:lang w:val="en-US" w:eastAsia="en-US" w:bidi="ar-SA"/>
+              </w:rPr>
+              <w:t>{{ "{:.0f}".format(row.percentage) }} %</w:t>
             </w:r>
           </w:p>
         </w:tc>
@@ -5484,7 +4480,7 @@
         <w:trPr/>
         <w:tc>
           <w:tcPr>
-            <w:tcW w:w="6300" w:type="dxa"/>
+            <w:tcW w:w="7754" w:type="dxa"/>
             <w:tcBorders/>
           </w:tcPr>
           <w:p>
@@ -5514,7 +4510,7 @@
         </w:tc>
         <w:tc>
           <w:tcPr>
-            <w:tcW w:w="1304" w:type="dxa"/>
+            <w:tcW w:w="1605" w:type="dxa"/>
             <w:tcBorders/>
           </w:tcPr>
           <w:p>

</xml_diff>